<commit_message>
updating final submission doc
</commit_message>
<xml_diff>
--- a/GIS-Data-Migration-Project/Assignment Documents/Final Project - Part 4 - Final Project Submission.docx
+++ b/GIS-Data-Migration-Project/Assignment Documents/Final Project - Part 4 - Final Project Submission.docx
@@ -810,13 +810,7 @@
         <w:rPr>
           <w:rFonts w:ascii="Times New Roman" w:hAnsi="Times New Roman" w:cs="Times New Roman"/>
         </w:rPr>
-        <w:t>Rolli</w:t>
-      </w:r>
-      <w:r>
-        <w:rPr>
-          <w:rFonts w:ascii="Times New Roman" w:hAnsi="Times New Roman" w:cs="Times New Roman"/>
-        </w:rPr>
-        <w:t xml:space="preserve">, </w:t>
+        <w:t xml:space="preserve">Rolli, </w:t>
       </w:r>
       <w:r>
         <w:rPr>
@@ -980,7 +974,19 @@
         <w:rPr>
           <w:rFonts w:ascii="Times New Roman" w:hAnsi="Times New Roman" w:cs="Times New Roman"/>
         </w:rPr>
-        <w:t>There were five data sources chosen for this project</w:t>
+        <w:t xml:space="preserve">There were </w:t>
+      </w:r>
+      <w:r>
+        <w:rPr>
+          <w:rFonts w:ascii="Times New Roman" w:hAnsi="Times New Roman" w:cs="Times New Roman"/>
+        </w:rPr>
+        <w:t>seven</w:t>
+      </w:r>
+      <w:r>
+        <w:rPr>
+          <w:rFonts w:ascii="Times New Roman" w:hAnsi="Times New Roman" w:cs="Times New Roman"/>
+        </w:rPr>
+        <w:t xml:space="preserve"> data sources chosen for this project</w:t>
       </w:r>
       <w:r>
         <w:rPr>
@@ -1100,6 +1106,30 @@
         </w:rPr>
         <w:t xml:space="preserve">Minnesota State Forests, County Parks, State Parks, and City Parks. </w:t>
       </w:r>
+      <w:r>
+        <w:rPr>
+          <w:rFonts w:ascii="Times New Roman" w:eastAsia="Arial" w:hAnsi="Times New Roman" w:cs="Times New Roman"/>
+          <w:color w:val="1A1A1A"/>
+        </w:rPr>
+        <w:t>(</w:t>
+      </w:r>
+      <w:hyperlink r:id="rId8" w:history="1">
+        <w:r>
+          <w:rPr>
+            <w:rStyle w:val="Hyperlink"/>
+            <w:rFonts w:ascii="Times New Roman" w:eastAsia="Arial" w:hAnsi="Times New Roman" w:cs="Times New Roman"/>
+            <w:color w:val="215E99" w:themeColor="text2" w:themeTint="BF"/>
+          </w:rPr>
+          <w:t>developers.google.com</w:t>
+        </w:r>
+      </w:hyperlink>
+      <w:r>
+        <w:rPr>
+          <w:rFonts w:ascii="Times New Roman" w:eastAsia="Arial" w:hAnsi="Times New Roman" w:cs="Times New Roman"/>
+          <w:color w:val="1A1A1A"/>
+        </w:rPr>
+        <w:t>)</w:t>
+      </w:r>
     </w:p>
     <w:p>
       <w:pPr>
@@ -1130,14 +1160,30 @@
         </w:rPr>
         <w:t xml:space="preserve"> — Managed by the State of Minnesota, this source provided the State Parks, Recreation Areas and Waysides dataset in shapefile format — a geospatial vector data format used in GIS software. (</w:t>
       </w:r>
-      <w:hyperlink r:id="rId8" w:history="1">
+      <w:hyperlink r:id="rId9" w:history="1">
         <w:r>
           <w:rPr>
             <w:rFonts w:ascii="Times New Roman" w:eastAsia="Arial" w:hAnsi="Times New Roman" w:cs="Times New Roman"/>
             <w:color w:val="0563C1"/>
             <w:u w:val="single"/>
           </w:rPr>
-          <w:t>gisdata.mn.gov</w:t>
+          <w:t>gisdata.m</w:t>
+        </w:r>
+        <w:r>
+          <w:rPr>
+            <w:rFonts w:ascii="Times New Roman" w:eastAsia="Arial" w:hAnsi="Times New Roman" w:cs="Times New Roman"/>
+            <w:color w:val="0563C1"/>
+            <w:u w:val="single"/>
+          </w:rPr>
+          <w:t>n</w:t>
+        </w:r>
+        <w:r>
+          <w:rPr>
+            <w:rFonts w:ascii="Times New Roman" w:eastAsia="Arial" w:hAnsi="Times New Roman" w:cs="Times New Roman"/>
+            <w:color w:val="0563C1"/>
+            <w:u w:val="single"/>
+          </w:rPr>
+          <w:t>.gov</w:t>
         </w:r>
       </w:hyperlink>
       <w:r>
@@ -1169,31 +1215,45 @@
           <w:color w:val="1A1A1A"/>
         </w:rPr>
         <w:lastRenderedPageBreak/>
-        <w:t>Recreation.gov (RIDB)</w:t>
-      </w:r>
-      <w:r>
-        <w:rPr>
-          <w:rFonts w:ascii="Times New Roman" w:eastAsia="Arial" w:hAnsi="Times New Roman" w:cs="Times New Roman"/>
-          <w:color w:val="1A1A1A"/>
-        </w:rPr>
-        <w:t xml:space="preserve"> — A dataset representing campgrounds and recreation areas managed by federal agencies across the United States, provided as downloadable CSV files. (</w:t>
-      </w:r>
-      <w:hyperlink r:id="rId9" w:history="1">
+        <w:t xml:space="preserve">MN Geospatial Commons </w:t>
+      </w:r>
+      <w:r>
+        <w:rPr>
+          <w:rFonts w:ascii="Times New Roman" w:hAnsi="Times New Roman" w:cs="Times New Roman"/>
+        </w:rPr>
+        <w:t xml:space="preserve">– Managed by the State of Minnesota, this source provided the State Forest Campgrounds and Day Use Areas dataset in shapefile format – a geospatial vector data format used in GIS software. </w:t>
+      </w:r>
+      <w:hyperlink r:id="rId10" w:history="1">
         <w:r>
           <w:rPr>
-            <w:rFonts w:ascii="Times New Roman" w:eastAsia="Arial" w:hAnsi="Times New Roman" w:cs="Times New Roman"/>
-            <w:color w:val="0563C1"/>
-            <w:u w:val="single"/>
+            <w:rStyle w:val="Hyperlink"/>
+            <w:rFonts w:ascii="Times New Roman" w:hAnsi="Times New Roman" w:cs="Times New Roman"/>
+            <w:color w:val="auto"/>
           </w:rPr>
-          <w:t>ridb.recreation.gov/download</w:t>
+          <w:t>(</w:t>
+        </w:r>
+        <w:r>
+          <w:rPr>
+            <w:rStyle w:val="Hyperlink"/>
+            <w:rFonts w:ascii="Times New Roman" w:hAnsi="Times New Roman" w:cs="Times New Roman"/>
+            <w:color w:val="215E99" w:themeColor="text2" w:themeTint="BF"/>
+          </w:rPr>
+          <w:t>gis.data.mn.gov</w:t>
+        </w:r>
+        <w:r>
+          <w:rPr>
+            <w:rStyle w:val="Hyperlink"/>
+            <w:rFonts w:ascii="Times New Roman" w:hAnsi="Times New Roman" w:cs="Times New Roman"/>
+            <w:color w:val="auto"/>
+          </w:rPr>
+          <w:t>)</w:t>
         </w:r>
       </w:hyperlink>
       <w:r>
         <w:rPr>
-          <w:rFonts w:ascii="Times New Roman" w:eastAsia="Arial" w:hAnsi="Times New Roman" w:cs="Times New Roman"/>
-          <w:color w:val="1A1A1A"/>
-        </w:rPr>
-        <w:t>)</w:t>
+          <w:rFonts w:ascii="Times New Roman" w:hAnsi="Times New Roman" w:cs="Times New Roman"/>
+        </w:rPr>
+        <w:t xml:space="preserve"> </w:t>
       </w:r>
     </w:p>
     <w:p>
@@ -1216,6 +1276,148 @@
           <w:bCs/>
           <w:color w:val="1A1A1A"/>
         </w:rPr>
+        <w:t xml:space="preserve">MN Geospatial Commons </w:t>
+      </w:r>
+      <w:r>
+        <w:rPr>
+          <w:rFonts w:ascii="Times New Roman" w:hAnsi="Times New Roman" w:cs="Times New Roman"/>
+        </w:rPr>
+        <w:t xml:space="preserve">– Managed by the State of Minnesota, this source provided the </w:t>
+      </w:r>
+      <w:r>
+        <w:rPr>
+          <w:rFonts w:ascii="Times New Roman" w:hAnsi="Times New Roman" w:cs="Times New Roman"/>
+        </w:rPr>
+        <w:t xml:space="preserve">DNR Parks and Trails Camping Units dataset in </w:t>
+      </w:r>
+      <w:proofErr w:type="spellStart"/>
+      <w:r>
+        <w:rPr>
+          <w:rFonts w:ascii="Times New Roman" w:hAnsi="Times New Roman" w:cs="Times New Roman"/>
+        </w:rPr>
+        <w:t>GeoPackage</w:t>
+      </w:r>
+      <w:proofErr w:type="spellEnd"/>
+      <w:r>
+        <w:rPr>
+          <w:rFonts w:ascii="Times New Roman" w:hAnsi="Times New Roman" w:cs="Times New Roman"/>
+        </w:rPr>
+        <w:t xml:space="preserve"> format – a</w:t>
+      </w:r>
+      <w:r>
+        <w:rPr>
+          <w:rFonts w:ascii="Times New Roman" w:hAnsi="Times New Roman" w:cs="Times New Roman"/>
+        </w:rPr>
+        <w:t xml:space="preserve"> platform-independent format used to transfer geospatial information (</w:t>
+      </w:r>
+      <w:proofErr w:type="spellStart"/>
+      <w:r>
+        <w:rPr>
+          <w:rFonts w:ascii="Times New Roman" w:hAnsi="Times New Roman" w:cs="Times New Roman"/>
+        </w:rPr>
+        <w:t>GeoPackage</w:t>
+      </w:r>
+      <w:proofErr w:type="spellEnd"/>
+      <w:r>
+        <w:rPr>
+          <w:rFonts w:ascii="Times New Roman" w:hAnsi="Times New Roman" w:cs="Times New Roman"/>
+        </w:rPr>
+        <w:t xml:space="preserve">). </w:t>
+      </w:r>
+      <w:hyperlink r:id="rId11" w:history="1">
+        <w:r>
+          <w:rPr>
+            <w:rStyle w:val="Hyperlink"/>
+            <w:rFonts w:ascii="Times New Roman" w:hAnsi="Times New Roman" w:cs="Times New Roman"/>
+            <w:color w:val="auto"/>
+          </w:rPr>
+          <w:t>(</w:t>
+        </w:r>
+        <w:r>
+          <w:rPr>
+            <w:rStyle w:val="Hyperlink"/>
+            <w:rFonts w:ascii="Times New Roman" w:hAnsi="Times New Roman" w:cs="Times New Roman"/>
+            <w:color w:val="215E99" w:themeColor="text2" w:themeTint="BF"/>
+          </w:rPr>
+          <w:t>gis.data.mn.gov</w:t>
+        </w:r>
+        <w:r>
+          <w:rPr>
+            <w:rStyle w:val="Hyperlink"/>
+            <w:rFonts w:ascii="Times New Roman" w:hAnsi="Times New Roman" w:cs="Times New Roman"/>
+            <w:color w:val="auto"/>
+          </w:rPr>
+          <w:t>)</w:t>
+        </w:r>
+      </w:hyperlink>
+    </w:p>
+    <w:p>
+      <w:pPr>
+        <w:pStyle w:val="ListParagraph"/>
+        <w:numPr>
+          <w:ilvl w:val="0"/>
+          <w:numId w:val="13"/>
+        </w:numPr>
+        <w:spacing w:after="120" w:line="240" w:lineRule="auto"/>
+        <w:contextualSpacing w:val="0"/>
+        <w:rPr>
+          <w:rFonts w:ascii="Times New Roman" w:hAnsi="Times New Roman" w:cs="Times New Roman"/>
+        </w:rPr>
+      </w:pPr>
+      <w:r>
+        <w:rPr>
+          <w:rFonts w:ascii="Times New Roman" w:eastAsia="Arial" w:hAnsi="Times New Roman" w:cs="Times New Roman"/>
+          <w:b/>
+          <w:bCs/>
+          <w:color w:val="1A1A1A"/>
+        </w:rPr>
+        <w:t>Recreation.gov (RIDB)</w:t>
+      </w:r>
+      <w:r>
+        <w:rPr>
+          <w:rFonts w:ascii="Times New Roman" w:eastAsia="Arial" w:hAnsi="Times New Roman" w:cs="Times New Roman"/>
+          <w:color w:val="1A1A1A"/>
+        </w:rPr>
+        <w:t xml:space="preserve"> — A dataset representing campgrounds and recreation areas managed by federal agencies across the United States, provided as downloadable CSV files. (</w:t>
+      </w:r>
+      <w:hyperlink r:id="rId12" w:history="1">
+        <w:r>
+          <w:rPr>
+            <w:rFonts w:ascii="Times New Roman" w:eastAsia="Arial" w:hAnsi="Times New Roman" w:cs="Times New Roman"/>
+            <w:color w:val="215E99" w:themeColor="text2" w:themeTint="BF"/>
+            <w:u w:val="single"/>
+          </w:rPr>
+          <w:t>ridb.recreation.gov/download</w:t>
+        </w:r>
+      </w:hyperlink>
+      <w:r>
+        <w:rPr>
+          <w:rFonts w:ascii="Times New Roman" w:eastAsia="Arial" w:hAnsi="Times New Roman" w:cs="Times New Roman"/>
+          <w:color w:val="1A1A1A"/>
+        </w:rPr>
+        <w:t>)</w:t>
+      </w:r>
+    </w:p>
+    <w:p>
+      <w:pPr>
+        <w:pStyle w:val="ListParagraph"/>
+        <w:numPr>
+          <w:ilvl w:val="0"/>
+          <w:numId w:val="13"/>
+        </w:numPr>
+        <w:spacing w:after="120" w:line="240" w:lineRule="auto"/>
+        <w:contextualSpacing w:val="0"/>
+        <w:rPr>
+          <w:rFonts w:ascii="Times New Roman" w:hAnsi="Times New Roman" w:cs="Times New Roman"/>
+        </w:rPr>
+      </w:pPr>
+      <w:r>
+        <w:rPr>
+          <w:rFonts w:ascii="Times New Roman" w:eastAsia="Arial" w:hAnsi="Times New Roman" w:cs="Times New Roman"/>
+          <w:b/>
+          <w:bCs/>
+          <w:color w:val="1A1A1A"/>
+        </w:rPr>
         <w:t>MN DNR Park and Trail Guide</w:t>
       </w:r>
       <w:r>
@@ -1225,7 +1427,7 @@
         </w:rPr>
         <w:t xml:space="preserve"> — A map published and updated annually by the Minnesota DNR that outlines attribute-based information for every State Park and Recreational Area in Minnesota. (</w:t>
       </w:r>
-      <w:hyperlink r:id="rId10" w:history="1">
+      <w:hyperlink r:id="rId13" w:history="1">
         <w:r>
           <w:rPr>
             <w:rFonts w:ascii="Times New Roman" w:eastAsia="Arial" w:hAnsi="Times New Roman" w:cs="Times New Roman"/>
@@ -1353,7 +1555,7 @@
                     </pic:cNvPicPr>
                   </pic:nvPicPr>
                   <pic:blipFill>
-                    <a:blip r:embed="rId11" cstate="print">
+                    <a:blip r:embed="rId14" cstate="print">
                       <a:extLst>
                         <a:ext uri="{28A0092B-C50C-407E-A947-70E740481C1C}">
                           <a14:useLocalDpi xmlns:a14="http://schemas.microsoft.com/office/drawing/2010/main" val="0"/>
@@ -1435,7 +1637,7 @@
                     </pic:cNvPicPr>
                   </pic:nvPicPr>
                   <pic:blipFill>
-                    <a:blip r:embed="rId12" cstate="print">
+                    <a:blip r:embed="rId15" cstate="print">
                       <a:extLst>
                         <a:ext uri="{28A0092B-C50C-407E-A947-70E740481C1C}">
                           <a14:useLocalDpi xmlns:a14="http://schemas.microsoft.com/office/drawing/2010/main" val="0"/>
@@ -1551,7 +1753,7 @@
                     </pic:cNvPicPr>
                   </pic:nvPicPr>
                   <pic:blipFill>
-                    <a:blip r:embed="rId13" cstate="print">
+                    <a:blip r:embed="rId16" cstate="print">
                       <a:extLst>
                         <a:ext uri="{28A0092B-C50C-407E-A947-70E740481C1C}">
                           <a14:useLocalDpi xmlns:a14="http://schemas.microsoft.com/office/drawing/2010/main" val="0"/>
@@ -1726,7 +1928,7 @@
                     </pic:cNvPicPr>
                   </pic:nvPicPr>
                   <pic:blipFill>
-                    <a:blip r:embed="rId14" cstate="print">
+                    <a:blip r:embed="rId17" cstate="print">
                       <a:extLst>
                         <a:ext uri="{28A0092B-C50C-407E-A947-70E740481C1C}">
                           <a14:useLocalDpi xmlns:a14="http://schemas.microsoft.com/office/drawing/2010/main" val="0"/>
@@ -1880,7 +2082,7 @@
                     <pic:cNvPicPr/>
                   </pic:nvPicPr>
                   <pic:blipFill>
-                    <a:blip r:embed="rId15"/>
+                    <a:blip r:embed="rId18"/>
                     <a:stretch>
                       <a:fillRect/>
                     </a:stretch>
@@ -2303,7 +2505,7 @@
                     <pic:cNvPicPr/>
                   </pic:nvPicPr>
                   <pic:blipFill>
-                    <a:blip r:embed="rId16"/>
+                    <a:blip r:embed="rId19"/>
                     <a:stretch>
                       <a:fillRect/>
                     </a:stretch>
@@ -2449,7 +2651,7 @@
                     <pic:cNvPicPr/>
                   </pic:nvPicPr>
                   <pic:blipFill>
-                    <a:blip r:embed="rId17"/>
+                    <a:blip r:embed="rId20"/>
                     <a:stretch>
                       <a:fillRect/>
                     </a:stretch>
@@ -2598,7 +2800,19 @@
         <w:rPr>
           <w:rFonts w:ascii="Times New Roman" w:hAnsi="Times New Roman" w:cs="Times New Roman"/>
         </w:rPr>
-        <w:t xml:space="preserve">Most of the five data sources (except for the RIDB CSV source) arrived in a denormalized or inconsistently structured format. The NPS API returns nested JSON with operating hours, and other information embedded inside location objects. Another example is how the MN GIS shapefile combines </w:t>
+        <w:t xml:space="preserve">Most of the </w:t>
+      </w:r>
+      <w:r>
+        <w:rPr>
+          <w:rFonts w:ascii="Times New Roman" w:hAnsi="Times New Roman" w:cs="Times New Roman"/>
+        </w:rPr>
+        <w:t>seven</w:t>
+      </w:r>
+      <w:r>
+        <w:rPr>
+          <w:rFonts w:ascii="Times New Roman" w:hAnsi="Times New Roman" w:cs="Times New Roman"/>
+        </w:rPr>
+        <w:t xml:space="preserve"> data sources (except for the RIDB CSV source) arrived in a denormalized or inconsistently structured format. The NPS API returns nested JSON with operating hours, and other information embedded inside location objects. Another example is how the MN GIS shapefile combines </w:t>
       </w:r>
       <w:proofErr w:type="gramStart"/>
       <w:r>
@@ -2960,7 +3174,7 @@
         </w:rPr>
         <w:lastRenderedPageBreak/>
         <w:drawing>
-          <wp:inline distT="0" distB="0" distL="0" distR="0" wp14:anchorId="198E54F9" wp14:editId="4AFFF2D1">
+          <wp:inline distT="0" distB="0" distL="0" distR="0" wp14:anchorId="198E54F9" wp14:editId="685F8FB2">
             <wp:extent cx="2878372" cy="5392267"/>
             <wp:effectExtent l="0" t="0" r="7620" b="7620"/>
             <wp:docPr id="367684458" name="Picture 2"/>
@@ -2977,7 +3191,7 @@
                     </pic:cNvPicPr>
                   </pic:nvPicPr>
                   <pic:blipFill>
-                    <a:blip r:embed="rId18" cstate="print">
+                    <a:blip r:embed="rId21" cstate="print">
                       <a:extLst>
                         <a:ext uri="{28A0092B-C50C-407E-A947-70E740481C1C}">
                           <a14:useLocalDpi xmlns:a14="http://schemas.microsoft.com/office/drawing/2010/main" val="0"/>
@@ -3346,7 +3560,7 @@
                     </pic:cNvPicPr>
                   </pic:nvPicPr>
                   <pic:blipFill>
-                    <a:blip r:embed="rId19" cstate="print">
+                    <a:blip r:embed="rId22" cstate="print">
                       <a:extLst>
                         <a:ext uri="{28A0092B-C50C-407E-A947-70E740481C1C}">
                           <a14:useLocalDpi xmlns:a14="http://schemas.microsoft.com/office/drawing/2010/main" val="0"/>
@@ -3582,7 +3796,7 @@
                     </pic:cNvPicPr>
                   </pic:nvPicPr>
                   <pic:blipFill>
-                    <a:blip r:embed="rId20" cstate="print">
+                    <a:blip r:embed="rId23" cstate="print">
                       <a:extLst>
                         <a:ext uri="{28A0092B-C50C-407E-A947-70E740481C1C}">
                           <a14:useLocalDpi xmlns:a14="http://schemas.microsoft.com/office/drawing/2010/main" val="0"/>
@@ -3822,6 +4036,7 @@
       <w:r>
         <w:rPr>
           <w:rFonts w:ascii="Times New Roman" w:hAnsi="Times New Roman" w:cs="Times New Roman"/>
+          <w:noProof/>
         </w:rPr>
         <w:lastRenderedPageBreak/>
         <w:drawing>
@@ -3840,7 +4055,7 @@
                     <pic:cNvPicPr/>
                   </pic:nvPicPr>
                   <pic:blipFill>
-                    <a:blip r:embed="rId21"/>
+                    <a:blip r:embed="rId24"/>
                     <a:stretch>
                       <a:fillRect/>
                     </a:stretch>
@@ -3872,6 +4087,7 @@
       <w:r>
         <w:rPr>
           <w:rFonts w:ascii="Times New Roman" w:hAnsi="Times New Roman" w:cs="Times New Roman"/>
+          <w:noProof/>
         </w:rPr>
         <w:lastRenderedPageBreak/>
         <w:drawing>
@@ -3890,7 +4106,7 @@
                     <pic:cNvPicPr/>
                   </pic:nvPicPr>
                   <pic:blipFill>
-                    <a:blip r:embed="rId22"/>
+                    <a:blip r:embed="rId25"/>
                     <a:stretch>
                       <a:fillRect/>
                     </a:stretch>
@@ -3922,6 +4138,7 @@
       <w:r>
         <w:rPr>
           <w:rFonts w:ascii="Times New Roman" w:hAnsi="Times New Roman" w:cs="Times New Roman"/>
+          <w:noProof/>
         </w:rPr>
         <w:lastRenderedPageBreak/>
         <w:drawing>
@@ -3940,7 +4157,7 @@
                     <pic:cNvPicPr/>
                   </pic:nvPicPr>
                   <pic:blipFill>
-                    <a:blip r:embed="rId23"/>
+                    <a:blip r:embed="rId26"/>
                     <a:stretch>
                       <a:fillRect/>
                     </a:stretch>
@@ -5155,27 +5372,13 @@
         </w:rPr>
         <w:t xml:space="preserve"> Map Library, </w:t>
       </w:r>
-      <w:hyperlink r:id="rId24" w:history="1">
+      <w:hyperlink r:id="rId27" w:history="1">
         <w:r>
           <w:rPr>
             <w:rStyle w:val="Hyperlink"/>
             <w:rFonts w:ascii="Times New Roman" w:hAnsi="Times New Roman" w:cs="Times New Roman"/>
           </w:rPr>
-          <w:t>https://www.maplibrary.org/10579/6-best-open-source-geodatabas</w:t>
-        </w:r>
-        <w:r>
-          <w:rPr>
-            <w:rStyle w:val="Hyperlink"/>
-            <w:rFonts w:ascii="Times New Roman" w:hAnsi="Times New Roman" w:cs="Times New Roman"/>
-          </w:rPr>
-          <w:t>e</w:t>
-        </w:r>
-        <w:r>
-          <w:rPr>
-            <w:rStyle w:val="Hyperlink"/>
-            <w:rFonts w:ascii="Times New Roman" w:hAnsi="Times New Roman" w:cs="Times New Roman"/>
-          </w:rPr>
-          <w:t>-solutions-to-explore/</w:t>
+          <w:t>https://www.maplibrary.org/10579/6-best-open-source-geodatabase-solutions-to-explore/</w:t>
         </w:r>
       </w:hyperlink>
       <w:r>
@@ -5285,7 +5488,7 @@
         </w:rPr>
         <w:t xml:space="preserve"> </w:t>
       </w:r>
-      <w:hyperlink r:id="rId25" w:history="1">
+      <w:hyperlink r:id="rId28" w:history="1">
         <w:r>
           <w:rPr>
             <w:rStyle w:val="Hyperlink"/>
@@ -5317,25 +5520,21 @@
         <w:rPr>
           <w:rFonts w:ascii="Times New Roman" w:hAnsi="Times New Roman" w:cs="Times New Roman"/>
         </w:rPr>
-        <w:t xml:space="preserve">Kutz, Jim. </w:t>
-      </w:r>
-      <w:r>
-        <w:rPr>
-          <w:rFonts w:ascii="Times New Roman" w:hAnsi="Times New Roman" w:cs="Times New Roman"/>
-        </w:rPr>
-        <w:t>“DuckDB vs Postgres</w:t>
-      </w:r>
-      <w:r>
-        <w:rPr>
-          <w:rFonts w:ascii="Times New Roman" w:hAnsi="Times New Roman" w:cs="Times New Roman"/>
-        </w:rPr>
-        <w:t xml:space="preserve"> - </w:t>
-      </w:r>
-      <w:r>
-        <w:rPr>
-          <w:rFonts w:ascii="Times New Roman" w:hAnsi="Times New Roman" w:cs="Times New Roman"/>
-        </w:rPr>
-        <w:t xml:space="preserve">Key Differences.” </w:t>
+        <w:t>“</w:t>
+      </w:r>
+      <w:proofErr w:type="spellStart"/>
+      <w:r>
+        <w:rPr>
+          <w:rFonts w:ascii="Times New Roman" w:hAnsi="Times New Roman" w:cs="Times New Roman"/>
+        </w:rPr>
+        <w:t>GeoPackage</w:t>
+      </w:r>
+      <w:proofErr w:type="spellEnd"/>
+      <w:r>
+        <w:rPr>
+          <w:rFonts w:ascii="Times New Roman" w:hAnsi="Times New Roman" w:cs="Times New Roman"/>
+        </w:rPr>
+        <w:t xml:space="preserve">.” </w:t>
       </w:r>
       <w:r>
         <w:rPr>
@@ -5343,55 +5542,101 @@
           <w:i/>
           <w:iCs/>
         </w:rPr>
-        <w:t>Airbyte.com</w:t>
-      </w:r>
-      <w:r>
-        <w:rPr>
-          <w:rFonts w:ascii="Times New Roman" w:hAnsi="Times New Roman" w:cs="Times New Roman"/>
-        </w:rPr>
-        <w:t xml:space="preserve">, </w:t>
-      </w:r>
-      <w:proofErr w:type="spellStart"/>
-      <w:r>
-        <w:rPr>
-          <w:rFonts w:ascii="Times New Roman" w:hAnsi="Times New Roman" w:cs="Times New Roman"/>
-        </w:rPr>
-        <w:t>Airbyte</w:t>
-      </w:r>
-      <w:proofErr w:type="spellEnd"/>
-      <w:r>
-        <w:rPr>
-          <w:rFonts w:ascii="Times New Roman" w:hAnsi="Times New Roman" w:cs="Times New Roman"/>
-        </w:rPr>
-        <w:t>, 1 Sept. 2025</w:t>
-      </w:r>
-      <w:r>
-        <w:rPr>
-          <w:rFonts w:ascii="Times New Roman" w:hAnsi="Times New Roman" w:cs="Times New Roman"/>
-        </w:rPr>
-        <w:t xml:space="preserve">, </w:t>
-      </w:r>
-      <w:hyperlink r:id="rId26" w:history="1">
+        <w:t>wikipedia.org</w:t>
+      </w:r>
+      <w:r>
+        <w:rPr>
+          <w:rFonts w:ascii="Times New Roman" w:hAnsi="Times New Roman" w:cs="Times New Roman"/>
+        </w:rPr>
+        <w:t xml:space="preserve">, Wikipedia, 3 Dec. 2024,  </w:t>
+      </w:r>
+      <w:hyperlink r:id="rId29" w:history="1">
         <w:r>
           <w:rPr>
             <w:rStyle w:val="Hyperlink"/>
             <w:rFonts w:ascii="Times New Roman" w:hAnsi="Times New Roman" w:cs="Times New Roman"/>
           </w:rPr>
-          <w:t>http</w:t>
+          <w:t>https://en.wikipedia.org/wiki/GeoPackage</w:t>
         </w:r>
+      </w:hyperlink>
+      <w:r>
+        <w:rPr>
+          <w:rFonts w:ascii="Times New Roman" w:hAnsi="Times New Roman" w:cs="Times New Roman"/>
+        </w:rPr>
+        <w:t>. Accessed 3 May 2026.</w:t>
+      </w:r>
+    </w:p>
+    <w:p>
+      <w:pPr>
+        <w:rPr>
+          <w:rFonts w:ascii="Times New Roman" w:hAnsi="Times New Roman" w:cs="Times New Roman"/>
+        </w:rPr>
+      </w:pPr>
+      <w:r>
+        <w:rPr>
+          <w:rFonts w:ascii="Times New Roman" w:hAnsi="Times New Roman" w:cs="Times New Roman"/>
+        </w:rPr>
+        <w:t xml:space="preserve">Kutz, Jim. </w:t>
+      </w:r>
+      <w:r>
+        <w:rPr>
+          <w:rFonts w:ascii="Times New Roman" w:hAnsi="Times New Roman" w:cs="Times New Roman"/>
+        </w:rPr>
+        <w:t>“DuckDB vs Postgres</w:t>
+      </w:r>
+      <w:r>
+        <w:rPr>
+          <w:rFonts w:ascii="Times New Roman" w:hAnsi="Times New Roman" w:cs="Times New Roman"/>
+        </w:rPr>
+        <w:t xml:space="preserve"> - </w:t>
+      </w:r>
+      <w:r>
+        <w:rPr>
+          <w:rFonts w:ascii="Times New Roman" w:hAnsi="Times New Roman" w:cs="Times New Roman"/>
+        </w:rPr>
+        <w:t xml:space="preserve">Key Differences.” </w:t>
+      </w:r>
+      <w:r>
+        <w:rPr>
+          <w:rFonts w:ascii="Times New Roman" w:hAnsi="Times New Roman" w:cs="Times New Roman"/>
+          <w:i/>
+          <w:iCs/>
+        </w:rPr>
+        <w:t>Airbyte.com</w:t>
+      </w:r>
+      <w:r>
+        <w:rPr>
+          <w:rFonts w:ascii="Times New Roman" w:hAnsi="Times New Roman" w:cs="Times New Roman"/>
+        </w:rPr>
+        <w:t xml:space="preserve">, </w:t>
+      </w:r>
+      <w:proofErr w:type="spellStart"/>
+      <w:r>
+        <w:rPr>
+          <w:rFonts w:ascii="Times New Roman" w:hAnsi="Times New Roman" w:cs="Times New Roman"/>
+        </w:rPr>
+        <w:t>Airbyte</w:t>
+      </w:r>
+      <w:proofErr w:type="spellEnd"/>
+      <w:r>
+        <w:rPr>
+          <w:rFonts w:ascii="Times New Roman" w:hAnsi="Times New Roman" w:cs="Times New Roman"/>
+        </w:rPr>
+        <w:t>, 1 Sept. 2025</w:t>
+      </w:r>
+      <w:r>
+        <w:rPr>
+          <w:rFonts w:ascii="Times New Roman" w:hAnsi="Times New Roman" w:cs="Times New Roman"/>
+        </w:rPr>
+        <w:t xml:space="preserve">, </w:t>
+      </w:r>
+      <w:hyperlink r:id="rId30" w:history="1">
         <w:r>
           <w:rPr>
             <w:rStyle w:val="Hyperlink"/>
             <w:rFonts w:ascii="Times New Roman" w:hAnsi="Times New Roman" w:cs="Times New Roman"/>
           </w:rPr>
-          <w:t>s</w:t>
-        </w:r>
-        <w:r>
-          <w:rPr>
-            <w:rStyle w:val="Hyperlink"/>
-            <w:rFonts w:ascii="Times New Roman" w:hAnsi="Times New Roman" w:cs="Times New Roman"/>
-          </w:rPr>
-          <w:t>://airbyte.com/data-engineering-resources/duckdb-vs-postgres</w:t>
+          <w:t>https://airbyte.com/data-engineering-resources/duckdb-vs-postgres</w:t>
         </w:r>
       </w:hyperlink>
       <w:r>
@@ -5497,7 +5742,7 @@
         </w:rPr>
         <w:t xml:space="preserve"> </w:t>
       </w:r>
-      <w:hyperlink r:id="rId27" w:history="1">
+      <w:hyperlink r:id="rId31" w:history="1">
         <w:r>
           <w:rPr>
             <w:rStyle w:val="Hyperlink"/>
@@ -5644,7 +5889,7 @@
         </w:rPr>
         <w:t xml:space="preserve"> </w:t>
       </w:r>
-      <w:hyperlink r:id="rId28" w:history="1">
+      <w:hyperlink r:id="rId32" w:history="1">
         <w:r>
           <w:rPr>
             <w:rStyle w:val="Hyperlink"/>
@@ -5726,27 +5971,13 @@
         </w:rPr>
         <w:t xml:space="preserve"> Glossary, </w:t>
       </w:r>
-      <w:hyperlink r:id="rId29" w:history="1">
+      <w:hyperlink r:id="rId33" w:history="1">
         <w:r>
           <w:rPr>
             <w:rStyle w:val="Hyperlink"/>
             <w:rFonts w:ascii="Times New Roman" w:hAnsi="Times New Roman" w:cs="Times New Roman"/>
           </w:rPr>
-          <w:t>https://</w:t>
-        </w:r>
-        <w:r>
-          <w:rPr>
-            <w:rStyle w:val="Hyperlink"/>
-            <w:rFonts w:ascii="Times New Roman" w:hAnsi="Times New Roman" w:cs="Times New Roman"/>
-          </w:rPr>
-          <w:t>m</w:t>
-        </w:r>
-        <w:r>
-          <w:rPr>
-            <w:rStyle w:val="Hyperlink"/>
-            <w:rFonts w:ascii="Times New Roman" w:hAnsi="Times New Roman" w:cs="Times New Roman"/>
-          </w:rPr>
-          <w:t>otherduck.com/glossary/schema/</w:t>
+          <w:t>https://motherduck.com/glossary/schema/</w:t>
         </w:r>
       </w:hyperlink>
       <w:r>
@@ -5812,7 +6043,7 @@
         </w:rPr>
         <w:t xml:space="preserve">, </w:t>
       </w:r>
-      <w:hyperlink r:id="rId30" w:history="1">
+      <w:hyperlink r:id="rId34" w:history="1">
         <w:r>
           <w:rPr>
             <w:rStyle w:val="Hyperlink"/>
@@ -5831,13 +6062,7 @@
         <w:rPr>
           <w:rFonts w:ascii="Times New Roman" w:hAnsi="Times New Roman" w:cs="Times New Roman"/>
         </w:rPr>
-        <w:t xml:space="preserve"> </w:t>
-      </w:r>
-      <w:r>
-        <w:rPr>
-          <w:rFonts w:ascii="Times New Roman" w:hAnsi="Times New Roman" w:cs="Times New Roman"/>
-        </w:rPr>
-        <w:t xml:space="preserve">Accessed </w:t>
+        <w:t xml:space="preserve"> Accessed </w:t>
       </w:r>
       <w:r>
         <w:rPr>
@@ -5858,7 +6083,7 @@
         </w:rPr>
         <w:t xml:space="preserve">“Top 5 Spatial Databases for GIS Professionals in 2025.” Geodata Insights, </w:t>
       </w:r>
-      <w:hyperlink r:id="rId31" w:history="1">
+      <w:hyperlink r:id="rId35" w:history="1">
         <w:r>
           <w:rPr>
             <w:rStyle w:val="Hyperlink"/>
@@ -5877,13 +6102,7 @@
         <w:rPr>
           <w:rFonts w:ascii="Times New Roman" w:hAnsi="Times New Roman" w:cs="Times New Roman"/>
         </w:rPr>
-        <w:t xml:space="preserve"> </w:t>
-      </w:r>
-      <w:r>
-        <w:rPr>
-          <w:rFonts w:ascii="Times New Roman" w:hAnsi="Times New Roman" w:cs="Times New Roman"/>
-        </w:rPr>
-        <w:t xml:space="preserve">Accessed </w:t>
+        <w:t xml:space="preserve"> Accessed </w:t>
       </w:r>
       <w:r>
         <w:rPr>
@@ -5948,7 +6167,7 @@
         </w:rPr>
         <w:t xml:space="preserve"> Minuscule Technologies, </w:t>
       </w:r>
-      <w:hyperlink r:id="rId32" w:history="1">
+      <w:hyperlink r:id="rId36" w:history="1">
         <w:r>
           <w:rPr>
             <w:rStyle w:val="Hyperlink"/>
@@ -5967,13 +6186,7 @@
         <w:rPr>
           <w:rFonts w:ascii="Times New Roman" w:hAnsi="Times New Roman" w:cs="Times New Roman"/>
         </w:rPr>
-        <w:t xml:space="preserve"> </w:t>
-      </w:r>
-      <w:r>
-        <w:rPr>
-          <w:rFonts w:ascii="Times New Roman" w:hAnsi="Times New Roman" w:cs="Times New Roman"/>
-        </w:rPr>
-        <w:t xml:space="preserve">Accessed </w:t>
+        <w:t xml:space="preserve"> Accessed </w:t>
       </w:r>
       <w:r>
         <w:rPr>
@@ -6014,9 +6227,10 @@
         <w:rPr>
           <w:rFonts w:ascii="Times New Roman" w:hAnsi="Times New Roman" w:cs="Times New Roman"/>
         </w:rPr>
+        <w:lastRenderedPageBreak/>
         <w:t xml:space="preserve">ChatGPT Discussion: </w:t>
       </w:r>
-      <w:hyperlink r:id="rId33" w:history="1">
+      <w:hyperlink r:id="rId37" w:history="1">
         <w:r>
           <w:rPr>
             <w:rStyle w:val="Hyperlink"/>
@@ -6038,7 +6252,7 @@
         </w:rPr>
         <w:t xml:space="preserve">DuckDB Repository: </w:t>
       </w:r>
-      <w:hyperlink r:id="rId34" w:history="1">
+      <w:hyperlink r:id="rId38" w:history="1">
         <w:r>
           <w:rPr>
             <w:rStyle w:val="Hyperlink"/>
@@ -6058,10 +6272,9 @@
         <w:rPr>
           <w:rFonts w:ascii="Times New Roman" w:hAnsi="Times New Roman" w:cs="Times New Roman"/>
         </w:rPr>
-        <w:lastRenderedPageBreak/>
         <w:t xml:space="preserve">DuckDB Documentation: </w:t>
       </w:r>
-      <w:hyperlink r:id="rId35" w:history="1">
+      <w:hyperlink r:id="rId39" w:history="1">
         <w:r>
           <w:rPr>
             <w:rStyle w:val="Hyperlink"/>
@@ -6089,7 +6302,7 @@
         </w:rPr>
         <w:t xml:space="preserve">GitHub Repository where project is managed: </w:t>
       </w:r>
-      <w:hyperlink r:id="rId36" w:history="1">
+      <w:hyperlink r:id="rId40" w:history="1">
         <w:r>
           <w:rPr>
             <w:rStyle w:val="Hyperlink"/>
@@ -6117,7 +6330,7 @@
         </w:rPr>
         <w:t xml:space="preserve">PostgreSQL Documentation: </w:t>
       </w:r>
-      <w:hyperlink r:id="rId37" w:history="1">
+      <w:hyperlink r:id="rId41" w:history="1">
         <w:r>
           <w:rPr>
             <w:rStyle w:val="Hyperlink"/>
@@ -6134,12 +6347,12 @@
       </w:r>
     </w:p>
     <w:sectPr>
-      <w:headerReference w:type="even" r:id="rId38"/>
-      <w:headerReference w:type="default" r:id="rId39"/>
-      <w:footerReference w:type="even" r:id="rId40"/>
-      <w:footerReference w:type="default" r:id="rId41"/>
-      <w:headerReference w:type="first" r:id="rId42"/>
-      <w:footerReference w:type="first" r:id="rId43"/>
+      <w:headerReference w:type="even" r:id="rId42"/>
+      <w:headerReference w:type="default" r:id="rId43"/>
+      <w:footerReference w:type="even" r:id="rId44"/>
+      <w:footerReference w:type="default" r:id="rId45"/>
+      <w:headerReference w:type="first" r:id="rId46"/>
+      <w:footerReference w:type="first" r:id="rId47"/>
       <w:pgSz w:w="12240" w:h="15840"/>
       <w:pgMar w:top="1440" w:right="1440" w:bottom="1440" w:left="1440" w:header="720" w:footer="720" w:gutter="0"/>
       <w:cols w:space="720"/>
@@ -8566,6 +8779,7 @@
   <w:style w:type="character" w:default="1" w:styleId="DefaultParagraphFont">
     <w:name w:val="Default Paragraph Font"/>
     <w:uiPriority w:val="1"/>
+    <w:semiHidden/>
     <w:unhideWhenUsed/>
   </w:style>
   <w:style w:type="table" w:default="1" w:styleId="TableNormal">

</xml_diff>

<commit_message>
final changes to the project code and document
Co-authored-by: Copilot <copilot@github.com>
</commit_message>
<xml_diff>
--- a/GIS-Data-Migration-Project/Assignment Documents/Final Project - Part 4 - Final Project Submission.docx
+++ b/GIS-Data-Migration-Project/Assignment Documents/Final Project - Part 4 - Final Project Submission.docx
@@ -336,7 +336,23 @@
           <w:rFonts w:ascii="Times New Roman" w:eastAsia="Arial" w:hAnsi="Times New Roman" w:cs="Times New Roman"/>
           <w:color w:val="1A1A1A"/>
         </w:rPr>
-        <w:t xml:space="preserve">My optimistic goal for this project is to build on top of my minimal goals by creating a mini demo web application where the DuckDB data is migrated into a PostgreSQL database with the PostGIS extension for geospatial data installed. The front end would utilize React as a mapping UI with a similar feel to Google Maps. The backend would be a simple Django/Python API layer that would serve the data from the database to the </w:t>
+        <w:t xml:space="preserve">My optimistic goal for this project is to build on top of my minimal goals by creating a mini demo web application where the DuckDB data is migrated into a PostgreSQL database with the PostGIS extension for geospatial data installed. The front end would utilize React as a mapping UI with a similar feel to Google Maps. The backend would be a simple </w:t>
+      </w:r>
+      <w:proofErr w:type="spellStart"/>
+      <w:r>
+        <w:rPr>
+          <w:rFonts w:ascii="Times New Roman" w:eastAsia="Arial" w:hAnsi="Times New Roman" w:cs="Times New Roman"/>
+          <w:color w:val="1A1A1A"/>
+        </w:rPr>
+        <w:t>FastAPI</w:t>
+      </w:r>
+      <w:proofErr w:type="spellEnd"/>
+      <w:r>
+        <w:rPr>
+          <w:rFonts w:ascii="Times New Roman" w:eastAsia="Arial" w:hAnsi="Times New Roman" w:cs="Times New Roman"/>
+          <w:color w:val="1A1A1A"/>
+        </w:rPr>
+        <w:t xml:space="preserve">/Python API layer that would serve the data from the database to the </w:t>
       </w:r>
       <w:proofErr w:type="gramStart"/>
       <w:r>
@@ -1167,23 +1183,7 @@
             <w:color w:val="0563C1"/>
             <w:u w:val="single"/>
           </w:rPr>
-          <w:t>gisdata.m</w:t>
-        </w:r>
-        <w:r>
-          <w:rPr>
-            <w:rFonts w:ascii="Times New Roman" w:eastAsia="Arial" w:hAnsi="Times New Roman" w:cs="Times New Roman"/>
-            <w:color w:val="0563C1"/>
-            <w:u w:val="single"/>
-          </w:rPr>
-          <w:t>n</w:t>
-        </w:r>
-        <w:r>
-          <w:rPr>
-            <w:rFonts w:ascii="Times New Roman" w:eastAsia="Arial" w:hAnsi="Times New Roman" w:cs="Times New Roman"/>
-            <w:color w:val="0563C1"/>
-            <w:u w:val="single"/>
-          </w:rPr>
-          <w:t>.gov</w:t>
+          <w:t>gisdata.mn.gov</w:t>
         </w:r>
       </w:hyperlink>
       <w:r>
@@ -1282,13 +1282,7 @@
         <w:rPr>
           <w:rFonts w:ascii="Times New Roman" w:hAnsi="Times New Roman" w:cs="Times New Roman"/>
         </w:rPr>
-        <w:t xml:space="preserve">– Managed by the State of Minnesota, this source provided the </w:t>
-      </w:r>
-      <w:r>
-        <w:rPr>
-          <w:rFonts w:ascii="Times New Roman" w:hAnsi="Times New Roman" w:cs="Times New Roman"/>
-        </w:rPr>
-        <w:t xml:space="preserve">DNR Parks and Trails Camping Units dataset in </w:t>
+        <w:t xml:space="preserve">– Managed by the State of Minnesota, this source provided the DNR Parks and Trails Camping Units dataset in </w:t>
       </w:r>
       <w:proofErr w:type="spellStart"/>
       <w:r>
@@ -3174,7 +3168,7 @@
         </w:rPr>
         <w:lastRenderedPageBreak/>
         <w:drawing>
-          <wp:inline distT="0" distB="0" distL="0" distR="0" wp14:anchorId="198E54F9" wp14:editId="685F8FB2">
+          <wp:inline distT="0" distB="0" distL="0" distR="0" wp14:anchorId="198E54F9" wp14:editId="11360EFA">
             <wp:extent cx="2878372" cy="5392267"/>
             <wp:effectExtent l="0" t="0" r="7620" b="7620"/>
             <wp:docPr id="367684458" name="Picture 2"/>
@@ -3892,15 +3886,7 @@
     </w:p>
     <w:p>
       <w:r>
-        <w:t xml:space="preserve">When it comes to geospatial queries, I initially set out to try using DuckDB’s Spatial Extension, however, after some trial and error I discovered that this extension is primarily </w:t>
-      </w:r>
-      <w:proofErr w:type="gramStart"/>
-      <w:r>
-        <w:t>operates</w:t>
-      </w:r>
-      <w:proofErr w:type="gramEnd"/>
-      <w:r>
-        <w:t xml:space="preserve"> on planar (Cartesian) geometry and not spherical (geodesic) in nature</w:t>
+        <w:t>When it comes to geospatial queries, I initially set out to try using DuckDB’s Spatial Extension, however, after some trial and error I discovered that this extension primarily operates on planar (Cartesian) geometry and not spherical (geodesic) in nature</w:t>
       </w:r>
       <w:r>
         <w:t xml:space="preserve"> (</w:t>
@@ -3929,6 +3915,89 @@
       </w:r>
       <w:r>
         <w:t xml:space="preserve">. I did try this with a few AI generated queries however, the most accuracy I was able to achieve after some iterations were locations that were up to 20 miles outside the chosen radius (20- and 50-mile radiuses in my tests) returning as results of running the query. Therefore, I decided to defer further geospatial calculations until I’ve been able to migrate the data into a PostgreSQL database where in combination with the PostGIS extension, I can run more accurate and easier to craft geospatial queries based on spherical calculations. </w:t>
+      </w:r>
+    </w:p>
+    <w:p>
+      <w:r>
+        <w:t>I was able to set up a PostgreSQL database locally on my computer and migrate the normalized data from the DuckDB into it. I then installed and configured the POSTGIS extension and was able to run the query below that simply returns the location’s name</w:t>
+      </w:r>
+      <w:r>
+        <w:t xml:space="preserve">, latitude and longitude for all locations within a 20-mile radius from the provided latitude and longitude coordinates. </w:t>
+      </w:r>
+    </w:p>
+    <w:p>
+      <w:r>
+        <w:rPr>
+          <w:noProof/>
+        </w:rPr>
+        <w:drawing>
+          <wp:inline distT="0" distB="0" distL="0" distR="0" wp14:anchorId="4C9BBFCC" wp14:editId="0AB97268">
+            <wp:extent cx="5943600" cy="3633470"/>
+            <wp:effectExtent l="0" t="0" r="0" b="5080"/>
+            <wp:docPr id="866093379" name="Picture 1"/>
+            <wp:cNvGraphicFramePr>
+              <a:graphicFrameLocks xmlns:a="http://schemas.openxmlformats.org/drawingml/2006/main" noChangeAspect="1"/>
+            </wp:cNvGraphicFramePr>
+            <a:graphic xmlns:a="http://schemas.openxmlformats.org/drawingml/2006/main">
+              <a:graphicData uri="http://schemas.openxmlformats.org/drawingml/2006/picture">
+                <pic:pic xmlns:pic="http://schemas.openxmlformats.org/drawingml/2006/picture">
+                  <pic:nvPicPr>
+                    <pic:cNvPr id="0" name="Picture 1"/>
+                    <pic:cNvPicPr>
+                      <a:picLocks noChangeAspect="1" noChangeArrowheads="1"/>
+                    </pic:cNvPicPr>
+                  </pic:nvPicPr>
+                  <pic:blipFill>
+                    <a:blip r:embed="rId24" cstate="print">
+                      <a:extLst>
+                        <a:ext uri="{28A0092B-C50C-407E-A947-70E740481C1C}">
+                          <a14:useLocalDpi xmlns:a14="http://schemas.microsoft.com/office/drawing/2010/main" val="0"/>
+                        </a:ext>
+                      </a:extLst>
+                    </a:blip>
+                    <a:srcRect/>
+                    <a:stretch>
+                      <a:fillRect/>
+                    </a:stretch>
+                  </pic:blipFill>
+                  <pic:spPr bwMode="auto">
+                    <a:xfrm>
+                      <a:off x="0" y="0"/>
+                      <a:ext cx="5943600" cy="3633470"/>
+                    </a:xfrm>
+                    <a:prstGeom prst="rect">
+                      <a:avLst/>
+                    </a:prstGeom>
+                    <a:noFill/>
+                    <a:ln>
+                      <a:noFill/>
+                    </a:ln>
+                  </pic:spPr>
+                </pic:pic>
+              </a:graphicData>
+            </a:graphic>
+          </wp:inline>
+        </w:drawing>
+      </w:r>
+    </w:p>
+    <w:p>
+      <w:pPr>
+        <w:spacing w:after="120" w:line="240" w:lineRule="auto"/>
+        <w:jc w:val="center"/>
+        <w:rPr>
+          <w:rFonts w:ascii="Times New Roman" w:hAnsi="Times New Roman" w:cs="Times New Roman"/>
+          <w:sz w:val="20"/>
+          <w:szCs w:val="20"/>
+        </w:rPr>
+      </w:pPr>
+      <w:r>
+        <w:rPr>
+          <w:rFonts w:ascii="Times New Roman" w:hAnsi="Times New Roman" w:cs="Times New Roman"/>
+          <w:noProof/>
+          <w:sz w:val="20"/>
+          <w:szCs w:val="20"/>
+        </w:rPr>
+        <w:t>Geospatial query utilizing the POSTGIS function ST_Distance to run a distance comparison query. The ‘::geography’ appended after ST_SetSRID casts the lat/lon coordinates to a geography type which results in ST_Distance returning more accurate but slower real spherical Earth calculations in meters (ST_Distance).</w:t>
       </w:r>
     </w:p>
     <w:p>
@@ -3952,6 +4021,7 @@
           <w:sz w:val="28"/>
           <w:szCs w:val="28"/>
         </w:rPr>
+        <w:lastRenderedPageBreak/>
         <w:t>General Join Queries</w:t>
       </w:r>
     </w:p>
@@ -4055,7 +4125,7 @@
                     <pic:cNvPicPr/>
                   </pic:nvPicPr>
                   <pic:blipFill>
-                    <a:blip r:embed="rId24"/>
+                    <a:blip r:embed="rId25"/>
                     <a:stretch>
                       <a:fillRect/>
                     </a:stretch>
@@ -4106,7 +4176,7 @@
                     <pic:cNvPicPr/>
                   </pic:nvPicPr>
                   <pic:blipFill>
-                    <a:blip r:embed="rId25"/>
+                    <a:blip r:embed="rId26"/>
                     <a:stretch>
                       <a:fillRect/>
                     </a:stretch>
@@ -4157,7 +4227,7 @@
                     <pic:cNvPicPr/>
                   </pic:nvPicPr>
                   <pic:blipFill>
-                    <a:blip r:embed="rId26"/>
+                    <a:blip r:embed="rId27"/>
                     <a:stretch>
                       <a:fillRect/>
                     </a:stretch>
@@ -4181,17 +4251,47 @@
     <w:p>
       <w:pPr>
         <w:spacing w:after="120" w:line="240" w:lineRule="auto"/>
-        <w:rPr>
-          <w:rFonts w:ascii="Times New Roman" w:hAnsi="Times New Roman" w:cs="Times New Roman"/>
-        </w:rPr>
-      </w:pPr>
-    </w:p>
-    <w:p>
-      <w:pPr>
-        <w:rPr>
-          <w:rFonts w:cs="Times New Roman"/>
-          <w:b/>
-          <w:bCs/>
+        <w:jc w:val="center"/>
+        <w:rPr>
+          <w:rFonts w:ascii="Times New Roman" w:hAnsi="Times New Roman" w:cs="Times New Roman"/>
+          <w:sz w:val="20"/>
+          <w:szCs w:val="20"/>
+        </w:rPr>
+      </w:pPr>
+      <w:r>
+        <w:rPr>
+          <w:rFonts w:ascii="Times New Roman" w:hAnsi="Times New Roman" w:cs="Times New Roman"/>
+          <w:noProof/>
+          <w:sz w:val="20"/>
+          <w:szCs w:val="20"/>
+        </w:rPr>
+        <w:lastRenderedPageBreak/>
+        <w:t xml:space="preserve">Complete DuckDB </w:t>
+      </w:r>
+      <w:r>
+        <w:rPr>
+          <w:rFonts w:ascii="Times New Roman" w:hAnsi="Times New Roman" w:cs="Times New Roman"/>
+          <w:noProof/>
+          <w:sz w:val="20"/>
+          <w:szCs w:val="20"/>
+        </w:rPr>
+        <w:t>JOIN query for all normalized SCHEMA tables. LEFT JOINs are used to ensure locations are included in the final query even if it doesn’t have any data that it associates with in a supporting table.</w:t>
+      </w:r>
+    </w:p>
+    <w:p>
+      <w:pPr>
+        <w:spacing w:after="120" w:line="240" w:lineRule="auto"/>
+        <w:jc w:val="center"/>
+        <w:rPr>
+          <w:rFonts w:ascii="Times New Roman" w:hAnsi="Times New Roman" w:cs="Times New Roman"/>
+        </w:rPr>
+      </w:pPr>
+    </w:p>
+    <w:p>
+      <w:pPr>
+        <w:pStyle w:val="Heading2"/>
+        <w:rPr>
+          <w:rFonts w:asciiTheme="minorHAnsi" w:hAnsiTheme="minorHAnsi"/>
           <w:color w:val="156082" w:themeColor="accent1"/>
           <w:sz w:val="28"/>
           <w:szCs w:val="28"/>
@@ -4199,69 +4299,619 @@
       </w:pPr>
       <w:r>
         <w:rPr>
-          <w:rFonts w:cs="Times New Roman"/>
+          <w:rFonts w:asciiTheme="minorHAnsi" w:eastAsia="Arial" w:hAnsiTheme="minorHAnsi" w:cs="Arial"/>
           <w:b/>
           <w:bCs/>
           <w:color w:val="156082" w:themeColor="accent1"/>
           <w:sz w:val="28"/>
           <w:szCs w:val="28"/>
         </w:rPr>
-        <w:t>Transactions – Transactional Safety Built in &amp; ACID</w:t>
-      </w:r>
-    </w:p>
-    <w:p>
-      <w:pPr>
-        <w:ind w:left="720"/>
-        <w:rPr>
-          <w:rFonts w:ascii="Times New Roman" w:hAnsi="Times New Roman" w:cs="Times New Roman"/>
-          <w:i/>
-          <w:iCs/>
-        </w:rPr>
-      </w:pPr>
-      <w:r>
-        <w:rPr>
-          <w:rFonts w:ascii="Times New Roman" w:hAnsi="Times New Roman" w:cs="Times New Roman"/>
-        </w:rPr>
-        <w:t xml:space="preserve">Textbook Reference: </w:t>
-      </w:r>
-      <w:r>
-        <w:rPr>
-          <w:rFonts w:ascii="Times New Roman" w:hAnsi="Times New Roman" w:cs="Times New Roman"/>
-          <w:i/>
-          <w:iCs/>
-        </w:rPr>
-        <w:t xml:space="preserve">Chapter </w:t>
-      </w:r>
-      <w:r>
-        <w:rPr>
-          <w:rFonts w:ascii="Times New Roman" w:hAnsi="Times New Roman" w:cs="Times New Roman"/>
-          <w:i/>
-          <w:iCs/>
-        </w:rPr>
-        <w:t>17;</w:t>
-      </w:r>
-      <w:r>
-        <w:rPr>
-          <w:rFonts w:ascii="Times New Roman" w:hAnsi="Times New Roman" w:cs="Times New Roman"/>
-          <w:i/>
-          <w:iCs/>
-        </w:rPr>
-        <w:t xml:space="preserve"> Transaction Management </w:t>
-      </w:r>
-      <w:r>
-        <w:rPr>
-          <w:rFonts w:ascii="Times New Roman" w:hAnsi="Times New Roman" w:cs="Times New Roman"/>
-          <w:i/>
-          <w:iCs/>
+        <w:t>Frontend, Backend &amp; PostgreSQL</w:t>
+      </w:r>
+    </w:p>
+    <w:p>
+      <w:pPr>
+        <w:spacing w:after="120" w:line="240" w:lineRule="auto"/>
+        <w:rPr>
+          <w:rFonts w:ascii="Times New Roman" w:hAnsi="Times New Roman" w:cs="Times New Roman"/>
+        </w:rPr>
+      </w:pPr>
+      <w:r>
+        <w:rPr>
+          <w:rFonts w:ascii="Times New Roman" w:hAnsi="Times New Roman" w:cs="Times New Roman"/>
+        </w:rPr>
+        <w:t>After accomplishing the transformation layer within DuckDB, I realized that I still had time to work on my optimistic goal. The full stack application layers were built in succession</w:t>
+      </w:r>
+      <w:r>
+        <w:rPr>
+          <w:rFonts w:ascii="Times New Roman" w:hAnsi="Times New Roman" w:cs="Times New Roman"/>
+        </w:rPr>
+        <w:t xml:space="preserve"> – first</w:t>
+      </w:r>
+      <w:r>
+        <w:rPr>
+          <w:rFonts w:ascii="Times New Roman" w:hAnsi="Times New Roman" w:cs="Times New Roman"/>
+        </w:rPr>
+        <w:t xml:space="preserve"> setting up the database locally,</w:t>
+      </w:r>
+      <w:r>
+        <w:rPr>
+          <w:rFonts w:ascii="Times New Roman" w:hAnsi="Times New Roman" w:cs="Times New Roman"/>
+        </w:rPr>
+        <w:t xml:space="preserve"> then the server, and finally the frontend. </w:t>
+      </w:r>
+      <w:r>
+        <w:rPr>
+          <w:rFonts w:ascii="Times New Roman" w:hAnsi="Times New Roman" w:cs="Times New Roman"/>
+        </w:rPr>
+        <w:t>It was built in this succession as each</w:t>
+      </w:r>
+      <w:r>
+        <w:rPr>
+          <w:rFonts w:ascii="Times New Roman" w:hAnsi="Times New Roman" w:cs="Times New Roman"/>
+        </w:rPr>
+        <w:t xml:space="preserve"> layer</w:t>
+      </w:r>
+      <w:r>
+        <w:rPr>
+          <w:rFonts w:ascii="Times New Roman" w:hAnsi="Times New Roman" w:cs="Times New Roman"/>
+        </w:rPr>
+        <w:t xml:space="preserve"> relied on portions of the previous layer</w:t>
+      </w:r>
+      <w:r>
+        <w:rPr>
+          <w:rFonts w:ascii="Times New Roman" w:hAnsi="Times New Roman" w:cs="Times New Roman"/>
+        </w:rPr>
+        <w:t xml:space="preserve"> already being set up</w:t>
+      </w:r>
+      <w:r>
+        <w:rPr>
+          <w:rFonts w:ascii="Times New Roman" w:hAnsi="Times New Roman" w:cs="Times New Roman"/>
+        </w:rPr>
+        <w:t xml:space="preserve">. The API needed the database to be set up and populated so the queries could be tested, and the frontend needed real data flowing from the API to properly configure </w:t>
+      </w:r>
+      <w:r>
+        <w:rPr>
+          <w:rFonts w:ascii="Times New Roman" w:hAnsi="Times New Roman" w:cs="Times New Roman"/>
+        </w:rPr>
+        <w:t>test how the UI would render.</w:t>
+      </w:r>
+      <w:r>
+        <w:rPr>
+          <w:rFonts w:ascii="Times New Roman" w:hAnsi="Times New Roman" w:cs="Times New Roman"/>
         </w:rPr>
         <w:t xml:space="preserve"> </w:t>
       </w:r>
     </w:p>
     <w:p>
       <w:pPr>
-        <w:pStyle w:val="Heading2"/>
-        <w:rPr>
-          <w:rFonts w:asciiTheme="minorHAnsi" w:eastAsia="Arial" w:hAnsiTheme="minorHAnsi" w:cs="Arial"/>
+        <w:spacing w:after="120" w:line="240" w:lineRule="auto"/>
+        <w:rPr>
+          <w:rFonts w:ascii="Times New Roman" w:hAnsi="Times New Roman" w:cs="Times New Roman"/>
+        </w:rPr>
+      </w:pPr>
+      <w:r>
+        <w:rPr>
+          <w:rFonts w:ascii="Times New Roman" w:hAnsi="Times New Roman" w:cs="Times New Roman"/>
+        </w:rPr>
+        <w:t xml:space="preserve">PostgreSQL version 18 was installed locally and configured with ease. Once set up, I created the first database (called </w:t>
+      </w:r>
+      <w:proofErr w:type="spellStart"/>
+      <w:r>
+        <w:rPr>
+          <w:rFonts w:ascii="Times New Roman" w:hAnsi="Times New Roman" w:cs="Times New Roman"/>
+        </w:rPr>
+        <w:t>explore_more</w:t>
+      </w:r>
+      <w:proofErr w:type="spellEnd"/>
+      <w:r>
+        <w:rPr>
+          <w:rFonts w:ascii="Times New Roman" w:hAnsi="Times New Roman" w:cs="Times New Roman"/>
+        </w:rPr>
+        <w:t xml:space="preserve">) and with the help of AI I was able to create a Python script that took the normalized schema tables from DuckDB and migrated them directly into the PostgreSQL database. This script takes advantage of the DuckDB PostgreSQL extension which allows for seamless communication between the two databases </w:t>
+      </w:r>
+      <w:r>
+        <w:rPr>
+          <w:rFonts w:ascii="Times New Roman" w:hAnsi="Times New Roman" w:cs="Times New Roman"/>
+        </w:rPr>
+        <w:t>(PostgreSQL).</w:t>
+      </w:r>
+      <w:r>
+        <w:rPr>
+          <w:rFonts w:ascii="Times New Roman" w:hAnsi="Times New Roman" w:cs="Times New Roman"/>
+        </w:rPr>
+        <w:t xml:space="preserve"> The Python script exists in the migration-scripts folder. </w:t>
+      </w:r>
+    </w:p>
+    <w:p>
+      <w:pPr>
+        <w:spacing w:after="120" w:line="240" w:lineRule="auto"/>
+        <w:rPr>
+          <w:rFonts w:ascii="Times New Roman" w:hAnsi="Times New Roman" w:cs="Times New Roman"/>
+        </w:rPr>
+      </w:pPr>
+      <w:r>
+        <w:rPr>
+          <w:noProof/>
+        </w:rPr>
+        <w:drawing>
+          <wp:inline distT="0" distB="0" distL="0" distR="0" wp14:anchorId="3F1776B7" wp14:editId="5AE6C1E3">
+            <wp:extent cx="5943600" cy="1394460"/>
+            <wp:effectExtent l="0" t="0" r="0" b="0"/>
+            <wp:docPr id="960483741" name="Picture 2"/>
+            <wp:cNvGraphicFramePr>
+              <a:graphicFrameLocks xmlns:a="http://schemas.openxmlformats.org/drawingml/2006/main" noChangeAspect="1"/>
+            </wp:cNvGraphicFramePr>
+            <a:graphic xmlns:a="http://schemas.openxmlformats.org/drawingml/2006/main">
+              <a:graphicData uri="http://schemas.openxmlformats.org/drawingml/2006/picture">
+                <pic:pic xmlns:pic="http://schemas.openxmlformats.org/drawingml/2006/picture">
+                  <pic:nvPicPr>
+                    <pic:cNvPr id="0" name="Picture 3"/>
+                    <pic:cNvPicPr>
+                      <a:picLocks noChangeAspect="1" noChangeArrowheads="1"/>
+                    </pic:cNvPicPr>
+                  </pic:nvPicPr>
+                  <pic:blipFill>
+                    <a:blip r:embed="rId28" cstate="print">
+                      <a:extLst>
+                        <a:ext uri="{28A0092B-C50C-407E-A947-70E740481C1C}">
+                          <a14:useLocalDpi xmlns:a14="http://schemas.microsoft.com/office/drawing/2010/main" val="0"/>
+                        </a:ext>
+                      </a:extLst>
+                    </a:blip>
+                    <a:srcRect/>
+                    <a:stretch>
+                      <a:fillRect/>
+                    </a:stretch>
+                  </pic:blipFill>
+                  <pic:spPr bwMode="auto">
+                    <a:xfrm>
+                      <a:off x="0" y="0"/>
+                      <a:ext cx="5943600" cy="1394460"/>
+                    </a:xfrm>
+                    <a:prstGeom prst="rect">
+                      <a:avLst/>
+                    </a:prstGeom>
+                    <a:noFill/>
+                    <a:ln>
+                      <a:noFill/>
+                    </a:ln>
+                  </pic:spPr>
+                </pic:pic>
+              </a:graphicData>
+            </a:graphic>
+          </wp:inline>
+        </w:drawing>
+      </w:r>
+    </w:p>
+    <w:p>
+      <w:pPr>
+        <w:spacing w:after="120" w:line="240" w:lineRule="auto"/>
+        <w:jc w:val="center"/>
+        <w:rPr>
+          <w:rFonts w:ascii="Times New Roman" w:hAnsi="Times New Roman" w:cs="Times New Roman"/>
+          <w:sz w:val="20"/>
+          <w:szCs w:val="20"/>
+        </w:rPr>
+      </w:pPr>
+      <w:r>
+        <w:rPr>
+          <w:rFonts w:ascii="Times New Roman" w:hAnsi="Times New Roman" w:cs="Times New Roman"/>
+          <w:noProof/>
+          <w:sz w:val="20"/>
+          <w:szCs w:val="20"/>
+        </w:rPr>
+        <w:t>Python code snapshot that shows the DuckDB PostgreSQL extension being installed and building the connection string for the script to connect to the PostgreSQL database the data is being migrated to.</w:t>
+      </w:r>
+    </w:p>
+    <w:p>
+      <w:pPr>
+        <w:spacing w:after="120" w:line="240" w:lineRule="auto"/>
+        <w:rPr>
+          <w:rFonts w:ascii="Times New Roman" w:hAnsi="Times New Roman" w:cs="Times New Roman"/>
+        </w:rPr>
+      </w:pPr>
+    </w:p>
+    <w:p>
+      <w:pPr>
+        <w:spacing w:after="120" w:line="240" w:lineRule="auto"/>
+        <w:rPr>
+          <w:rFonts w:ascii="Times New Roman" w:hAnsi="Times New Roman" w:cs="Times New Roman"/>
+        </w:rPr>
+      </w:pPr>
+      <w:r>
+        <w:rPr>
+          <w:rFonts w:ascii="Times New Roman" w:hAnsi="Times New Roman" w:cs="Times New Roman"/>
+        </w:rPr>
+        <w:t xml:space="preserve">Once the database was set up, it was time to configure the API. It is a single Python script in the backend folder and was built using the </w:t>
+      </w:r>
+      <w:proofErr w:type="spellStart"/>
+      <w:r>
+        <w:rPr>
+          <w:rFonts w:ascii="Times New Roman" w:hAnsi="Times New Roman" w:cs="Times New Roman"/>
+        </w:rPr>
+        <w:t>FastAPI</w:t>
+      </w:r>
+      <w:proofErr w:type="spellEnd"/>
+      <w:r>
+        <w:rPr>
+          <w:rFonts w:ascii="Times New Roman" w:hAnsi="Times New Roman" w:cs="Times New Roman"/>
+        </w:rPr>
+        <w:t xml:space="preserve"> library and defines three endpoints each with a query specifically crafted to collect specific data from the database. The first is a geospatial endpoint that accepts minimum and maximum latitude and longitude coordinates, constructs a bounding box (dubbed </w:t>
+      </w:r>
+      <w:proofErr w:type="spellStart"/>
+      <w:r>
+        <w:rPr>
+          <w:rFonts w:ascii="Times New Roman" w:hAnsi="Times New Roman" w:cs="Times New Roman"/>
+        </w:rPr>
+        <w:t>bbox</w:t>
+      </w:r>
+      <w:proofErr w:type="spellEnd"/>
+      <w:r>
+        <w:rPr>
+          <w:rFonts w:ascii="Times New Roman" w:hAnsi="Times New Roman" w:cs="Times New Roman"/>
+        </w:rPr>
+        <w:t xml:space="preserve">) and returns all the locations within it. </w:t>
+      </w:r>
+      <w:r>
+        <w:rPr>
+          <w:rFonts w:ascii="Times New Roman" w:hAnsi="Times New Roman" w:cs="Times New Roman"/>
+        </w:rPr>
+        <w:t xml:space="preserve">The second is a search endpoint that performs a search against each location’s name and description columns given a search query string. The third is a location details endpoint that aggregates information from all the tables int a comprehensive response. </w:t>
+      </w:r>
+    </w:p>
+    <w:p>
+      <w:pPr>
+        <w:spacing w:after="120" w:line="240" w:lineRule="auto"/>
+        <w:rPr>
+          <w:rFonts w:ascii="Times New Roman" w:hAnsi="Times New Roman" w:cs="Times New Roman"/>
+        </w:rPr>
+      </w:pPr>
+      <w:r>
+        <w:rPr>
+          <w:noProof/>
+        </w:rPr>
+        <w:lastRenderedPageBreak/>
+        <w:drawing>
+          <wp:inline distT="0" distB="0" distL="0" distR="0" wp14:anchorId="261DFCCF" wp14:editId="3F7BCD80">
+            <wp:extent cx="5943600" cy="6321425"/>
+            <wp:effectExtent l="0" t="0" r="0" b="3175"/>
+            <wp:docPr id="493455166" name="Picture 4"/>
+            <wp:cNvGraphicFramePr>
+              <a:graphicFrameLocks xmlns:a="http://schemas.openxmlformats.org/drawingml/2006/main" noChangeAspect="1"/>
+            </wp:cNvGraphicFramePr>
+            <a:graphic xmlns:a="http://schemas.openxmlformats.org/drawingml/2006/main">
+              <a:graphicData uri="http://schemas.openxmlformats.org/drawingml/2006/picture">
+                <pic:pic xmlns:pic="http://schemas.openxmlformats.org/drawingml/2006/picture">
+                  <pic:nvPicPr>
+                    <pic:cNvPr id="0" name="Picture 7"/>
+                    <pic:cNvPicPr>
+                      <a:picLocks noChangeAspect="1" noChangeArrowheads="1"/>
+                    </pic:cNvPicPr>
+                  </pic:nvPicPr>
+                  <pic:blipFill>
+                    <a:blip r:embed="rId29" cstate="print">
+                      <a:extLst>
+                        <a:ext uri="{28A0092B-C50C-407E-A947-70E740481C1C}">
+                          <a14:useLocalDpi xmlns:a14="http://schemas.microsoft.com/office/drawing/2010/main" val="0"/>
+                        </a:ext>
+                      </a:extLst>
+                    </a:blip>
+                    <a:srcRect/>
+                    <a:stretch>
+                      <a:fillRect/>
+                    </a:stretch>
+                  </pic:blipFill>
+                  <pic:spPr bwMode="auto">
+                    <a:xfrm>
+                      <a:off x="0" y="0"/>
+                      <a:ext cx="5943600" cy="6321425"/>
+                    </a:xfrm>
+                    <a:prstGeom prst="rect">
+                      <a:avLst/>
+                    </a:prstGeom>
+                    <a:noFill/>
+                    <a:ln>
+                      <a:noFill/>
+                    </a:ln>
+                  </pic:spPr>
+                </pic:pic>
+              </a:graphicData>
+            </a:graphic>
+          </wp:inline>
+        </w:drawing>
+      </w:r>
+    </w:p>
+    <w:p>
+      <w:pPr>
+        <w:spacing w:after="120" w:line="240" w:lineRule="auto"/>
+        <w:jc w:val="center"/>
+        <w:rPr>
+          <w:rFonts w:ascii="Times New Roman" w:hAnsi="Times New Roman" w:cs="Times New Roman"/>
+          <w:sz w:val="20"/>
+          <w:szCs w:val="20"/>
+        </w:rPr>
+      </w:pPr>
+      <w:r>
+        <w:rPr>
+          <w:rFonts w:ascii="Times New Roman" w:hAnsi="Times New Roman" w:cs="Times New Roman"/>
+          <w:noProof/>
+          <w:sz w:val="20"/>
+          <w:szCs w:val="20"/>
+        </w:rPr>
+        <w:t xml:space="preserve">Python code snapshot that shows </w:t>
+      </w:r>
+      <w:r>
+        <w:rPr>
+          <w:rFonts w:ascii="Times New Roman" w:hAnsi="Times New Roman" w:cs="Times New Roman"/>
+          <w:noProof/>
+          <w:sz w:val="20"/>
+          <w:szCs w:val="20"/>
+        </w:rPr>
+        <w:t xml:space="preserve">the geospatial query used for the bbox endpoint. </w:t>
+      </w:r>
+    </w:p>
+    <w:p>
+      <w:pPr>
+        <w:spacing w:after="120" w:line="240" w:lineRule="auto"/>
+        <w:rPr>
+          <w:rFonts w:ascii="Times New Roman" w:hAnsi="Times New Roman" w:cs="Times New Roman"/>
+        </w:rPr>
+      </w:pPr>
+    </w:p>
+    <w:p>
+      <w:pPr>
+        <w:spacing w:after="120" w:line="240" w:lineRule="auto"/>
+        <w:rPr>
+          <w:rFonts w:ascii="Times New Roman" w:hAnsi="Times New Roman" w:cs="Times New Roman"/>
+        </w:rPr>
+      </w:pPr>
+      <w:r>
+        <w:rPr>
+          <w:rFonts w:ascii="Times New Roman" w:hAnsi="Times New Roman" w:cs="Times New Roman"/>
+        </w:rPr>
+        <w:t xml:space="preserve">As for the </w:t>
+      </w:r>
+      <w:proofErr w:type="gramStart"/>
+      <w:r>
+        <w:rPr>
+          <w:rFonts w:ascii="Times New Roman" w:hAnsi="Times New Roman" w:cs="Times New Roman"/>
+        </w:rPr>
+        <w:t>frontend</w:t>
+      </w:r>
+      <w:proofErr w:type="gramEnd"/>
+      <w:r>
+        <w:rPr>
+          <w:rFonts w:ascii="Times New Roman" w:hAnsi="Times New Roman" w:cs="Times New Roman"/>
+        </w:rPr>
+        <w:t xml:space="preserve">, it is built using Typescript, React, React-Leaflet, </w:t>
+      </w:r>
+      <w:proofErr w:type="spellStart"/>
+      <w:r>
+        <w:rPr>
+          <w:rFonts w:ascii="Times New Roman" w:hAnsi="Times New Roman" w:cs="Times New Roman"/>
+        </w:rPr>
+        <w:t>Mantine</w:t>
+      </w:r>
+      <w:proofErr w:type="spellEnd"/>
+      <w:r>
+        <w:rPr>
+          <w:rFonts w:ascii="Times New Roman" w:hAnsi="Times New Roman" w:cs="Times New Roman"/>
+        </w:rPr>
+        <w:t xml:space="preserve">, and </w:t>
+      </w:r>
+      <w:proofErr w:type="spellStart"/>
+      <w:r>
+        <w:rPr>
+          <w:rFonts w:ascii="Times New Roman" w:hAnsi="Times New Roman" w:cs="Times New Roman"/>
+        </w:rPr>
+        <w:t>TanStack</w:t>
+      </w:r>
+      <w:proofErr w:type="spellEnd"/>
+      <w:r>
+        <w:rPr>
+          <w:rFonts w:ascii="Times New Roman" w:hAnsi="Times New Roman" w:cs="Times New Roman"/>
+        </w:rPr>
+        <w:t xml:space="preserve"> libraries. React-Leaflet is the React port of a popular mapping library for the web called Leaflet. </w:t>
+      </w:r>
+      <w:proofErr w:type="spellStart"/>
+      <w:r>
+        <w:rPr>
+          <w:rFonts w:ascii="Times New Roman" w:hAnsi="Times New Roman" w:cs="Times New Roman"/>
+        </w:rPr>
+        <w:t>Mantine</w:t>
+      </w:r>
+      <w:proofErr w:type="spellEnd"/>
+      <w:r>
+        <w:rPr>
+          <w:rFonts w:ascii="Times New Roman" w:hAnsi="Times New Roman" w:cs="Times New Roman"/>
+        </w:rPr>
+        <w:t xml:space="preserve"> is a component library that enables quick iteration and pre-designed, drop-in components. As for </w:t>
+      </w:r>
+      <w:proofErr w:type="spellStart"/>
+      <w:r>
+        <w:rPr>
+          <w:rFonts w:ascii="Times New Roman" w:hAnsi="Times New Roman" w:cs="Times New Roman"/>
+        </w:rPr>
+        <w:t>TanStack</w:t>
+      </w:r>
+      <w:proofErr w:type="spellEnd"/>
+      <w:r>
+        <w:rPr>
+          <w:rFonts w:ascii="Times New Roman" w:hAnsi="Times New Roman" w:cs="Times New Roman"/>
+        </w:rPr>
+        <w:t xml:space="preserve">, it is used to manage client-side caching and data fetching. </w:t>
+      </w:r>
+      <w:r>
+        <w:rPr>
+          <w:rFonts w:ascii="Times New Roman" w:hAnsi="Times New Roman" w:cs="Times New Roman"/>
+        </w:rPr>
+        <w:lastRenderedPageBreak/>
+        <w:t xml:space="preserve">Together these libraries allow users to better visualize and interact with the data that is stored in the database. </w:t>
+      </w:r>
+    </w:p>
+    <w:p>
+      <w:pPr>
+        <w:spacing w:after="120" w:line="240" w:lineRule="auto"/>
+        <w:rPr>
+          <w:rFonts w:ascii="Times New Roman" w:hAnsi="Times New Roman" w:cs="Times New Roman"/>
+        </w:rPr>
+      </w:pPr>
+      <w:r>
+        <w:rPr>
+          <w:noProof/>
+        </w:rPr>
+        <w:drawing>
+          <wp:inline distT="0" distB="0" distL="0" distR="0" wp14:anchorId="20D3088C" wp14:editId="63EB6015">
+            <wp:extent cx="5943600" cy="3131185"/>
+            <wp:effectExtent l="0" t="0" r="0" b="0"/>
+            <wp:docPr id="23600991" name="Picture 1"/>
+            <wp:cNvGraphicFramePr>
+              <a:graphicFrameLocks xmlns:a="http://schemas.openxmlformats.org/drawingml/2006/main" noChangeAspect="1"/>
+            </wp:cNvGraphicFramePr>
+            <a:graphic xmlns:a="http://schemas.openxmlformats.org/drawingml/2006/main">
+              <a:graphicData uri="http://schemas.openxmlformats.org/drawingml/2006/picture">
+                <pic:pic xmlns:pic="http://schemas.openxmlformats.org/drawingml/2006/picture">
+                  <pic:nvPicPr>
+                    <pic:cNvPr id="23600991" name=""/>
+                    <pic:cNvPicPr/>
+                  </pic:nvPicPr>
+                  <pic:blipFill>
+                    <a:blip r:embed="rId30"/>
+                    <a:stretch>
+                      <a:fillRect/>
+                    </a:stretch>
+                  </pic:blipFill>
+                  <pic:spPr>
+                    <a:xfrm>
+                      <a:off x="0" y="0"/>
+                      <a:ext cx="5943600" cy="3131185"/>
+                    </a:xfrm>
+                    <a:prstGeom prst="rect">
+                      <a:avLst/>
+                    </a:prstGeom>
+                  </pic:spPr>
+                </pic:pic>
+              </a:graphicData>
+            </a:graphic>
+          </wp:inline>
+        </w:drawing>
+      </w:r>
+    </w:p>
+    <w:p>
+      <w:pPr>
+        <w:spacing w:after="120" w:line="240" w:lineRule="auto"/>
+        <w:jc w:val="center"/>
+        <w:rPr>
+          <w:rFonts w:ascii="Times New Roman" w:hAnsi="Times New Roman" w:cs="Times New Roman"/>
+          <w:noProof/>
+          <w:sz w:val="20"/>
+          <w:szCs w:val="20"/>
+        </w:rPr>
+      </w:pPr>
+      <w:r>
+        <w:rPr>
+          <w:rFonts w:ascii="Times New Roman" w:hAnsi="Times New Roman" w:cs="Times New Roman"/>
+          <w:noProof/>
+          <w:sz w:val="20"/>
+          <w:szCs w:val="20"/>
+        </w:rPr>
+        <w:t>Snapshot of the frontend map that displays location data collected along the Minnesota North Shore</w:t>
+      </w:r>
+    </w:p>
+    <w:p>
+      <w:pPr>
+        <w:spacing w:after="120" w:line="240" w:lineRule="auto"/>
+        <w:jc w:val="center"/>
+        <w:rPr>
+          <w:rFonts w:ascii="Times New Roman" w:hAnsi="Times New Roman" w:cs="Times New Roman"/>
+          <w:noProof/>
+          <w:sz w:val="20"/>
+          <w:szCs w:val="20"/>
+        </w:rPr>
+      </w:pPr>
+      <w:r>
+        <w:rPr>
+          <w:noProof/>
+        </w:rPr>
+        <w:drawing>
+          <wp:inline distT="0" distB="0" distL="0" distR="0" wp14:anchorId="17CBACCF" wp14:editId="4034AA73">
+            <wp:extent cx="5943600" cy="3163570"/>
+            <wp:effectExtent l="0" t="0" r="0" b="0"/>
+            <wp:docPr id="839869104" name="Picture 1"/>
+            <wp:cNvGraphicFramePr>
+              <a:graphicFrameLocks xmlns:a="http://schemas.openxmlformats.org/drawingml/2006/main" noChangeAspect="1"/>
+            </wp:cNvGraphicFramePr>
+            <a:graphic xmlns:a="http://schemas.openxmlformats.org/drawingml/2006/main">
+              <a:graphicData uri="http://schemas.openxmlformats.org/drawingml/2006/picture">
+                <pic:pic xmlns:pic="http://schemas.openxmlformats.org/drawingml/2006/picture">
+                  <pic:nvPicPr>
+                    <pic:cNvPr id="839869104" name=""/>
+                    <pic:cNvPicPr/>
+                  </pic:nvPicPr>
+                  <pic:blipFill>
+                    <a:blip r:embed="rId31"/>
+                    <a:stretch>
+                      <a:fillRect/>
+                    </a:stretch>
+                  </pic:blipFill>
+                  <pic:spPr>
+                    <a:xfrm>
+                      <a:off x="0" y="0"/>
+                      <a:ext cx="5943600" cy="3163570"/>
+                    </a:xfrm>
+                    <a:prstGeom prst="rect">
+                      <a:avLst/>
+                    </a:prstGeom>
+                  </pic:spPr>
+                </pic:pic>
+              </a:graphicData>
+            </a:graphic>
+          </wp:inline>
+        </w:drawing>
+      </w:r>
+    </w:p>
+    <w:p>
+      <w:pPr>
+        <w:spacing w:after="120" w:line="240" w:lineRule="auto"/>
+        <w:jc w:val="center"/>
+        <w:rPr>
+          <w:rFonts w:ascii="Times New Roman" w:hAnsi="Times New Roman" w:cs="Times New Roman"/>
+          <w:sz w:val="20"/>
+          <w:szCs w:val="20"/>
+        </w:rPr>
+      </w:pPr>
+      <w:r>
+        <w:rPr>
+          <w:rFonts w:ascii="Times New Roman" w:hAnsi="Times New Roman" w:cs="Times New Roman"/>
+          <w:noProof/>
+          <w:sz w:val="20"/>
+          <w:szCs w:val="20"/>
+        </w:rPr>
+        <w:t xml:space="preserve">Snapshot of the frontend map that </w:t>
+      </w:r>
+      <w:r>
+        <w:rPr>
+          <w:rFonts w:ascii="Times New Roman" w:hAnsi="Times New Roman" w:cs="Times New Roman"/>
+          <w:noProof/>
+          <w:sz w:val="20"/>
+          <w:szCs w:val="20"/>
+        </w:rPr>
+        <w:t>displays detailed data extracted from the DNR MN PDF document</w:t>
+      </w:r>
+    </w:p>
+    <w:p>
+      <w:pPr>
+        <w:spacing w:after="120" w:line="240" w:lineRule="auto"/>
+        <w:rPr>
+          <w:rFonts w:ascii="Times New Roman" w:hAnsi="Times New Roman" w:cs="Times New Roman"/>
+        </w:rPr>
+      </w:pPr>
+    </w:p>
+    <w:p>
+      <w:pPr>
+        <w:rPr>
+          <w:rFonts w:cs="Times New Roman"/>
           <w:b/>
           <w:bCs/>
           <w:color w:val="156082" w:themeColor="accent1"/>
@@ -4271,57 +4921,63 @@
       </w:pPr>
       <w:r>
         <w:rPr>
-          <w:rFonts w:asciiTheme="minorHAnsi" w:eastAsia="Arial" w:hAnsiTheme="minorHAnsi" w:cs="Arial"/>
+          <w:rFonts w:cs="Times New Roman"/>
           <w:b/>
           <w:bCs/>
           <w:color w:val="156082" w:themeColor="accent1"/>
           <w:sz w:val="28"/>
           <w:szCs w:val="28"/>
         </w:rPr>
-        <w:t>Transactions</w:t>
-      </w:r>
-    </w:p>
-    <w:p>
-      <w:pPr>
-        <w:rPr>
-          <w:rFonts w:ascii="Times New Roman" w:hAnsi="Times New Roman" w:cs="Times New Roman"/>
-        </w:rPr>
-      </w:pPr>
-      <w:r>
-        <w:rPr>
-          <w:rFonts w:ascii="Times New Roman" w:hAnsi="Times New Roman" w:cs="Times New Roman"/>
-        </w:rPr>
-        <w:t xml:space="preserve">I mainly utilized transactional safety when working on running the INSERT queries from the data source tables into the final normalized </w:t>
-      </w:r>
-      <w:r>
-        <w:rPr>
-          <w:rFonts w:ascii="Times New Roman" w:hAnsi="Times New Roman" w:cs="Times New Roman"/>
-        </w:rPr>
-        <w:t>schema</w:t>
-      </w:r>
-      <w:r>
-        <w:rPr>
-          <w:rFonts w:ascii="Times New Roman" w:hAnsi="Times New Roman" w:cs="Times New Roman"/>
-        </w:rPr>
-        <w:t xml:space="preserve">. </w:t>
-      </w:r>
-      <w:r>
-        <w:rPr>
-          <w:rFonts w:ascii="Times New Roman" w:hAnsi="Times New Roman" w:cs="Times New Roman"/>
-        </w:rPr>
-        <w:t>W</w:t>
-      </w:r>
-      <w:r>
-        <w:rPr>
-          <w:rFonts w:ascii="Times New Roman" w:hAnsi="Times New Roman" w:cs="Times New Roman"/>
-        </w:rPr>
-        <w:t>hile doing this one thing that I wanted to keep track of and manage is only</w:t>
-      </w:r>
-      <w:r>
-        <w:rPr>
-          <w:rFonts w:ascii="Times New Roman" w:hAnsi="Times New Roman" w:cs="Times New Roman"/>
-        </w:rPr>
-        <w:t xml:space="preserve"> to update the normalized namespace tables if the entire migrations script succeeds. To achieve this, I created an individual SQL script file for each source and wrapped all the migration logic (aka the INSERT queries) in a single transaction using BEGIN TRANSACTION and COMMIT. This allows all INSERT statements to be executed within one transaction block, and if any step fails during execution, the transaction is not committed, the transaction is automatically rolled back and none of the data that was being transferred during the transaction makes it into any of the normalized namespace tables. This approach guarantees no partial data ever makes it into any of the tables and I don’t have worry about data duplication or remnant data existing from a previous data transformation/migration attempt.</w:t>
+        <w:lastRenderedPageBreak/>
+        <w:t>Transactions – Transactional Safety Built in &amp; ACID</w:t>
+      </w:r>
+    </w:p>
+    <w:p>
+      <w:pPr>
+        <w:ind w:left="720"/>
+        <w:rPr>
+          <w:rFonts w:ascii="Times New Roman" w:hAnsi="Times New Roman" w:cs="Times New Roman"/>
+          <w:i/>
+          <w:iCs/>
+        </w:rPr>
+      </w:pPr>
+      <w:r>
+        <w:rPr>
+          <w:rFonts w:ascii="Times New Roman" w:hAnsi="Times New Roman" w:cs="Times New Roman"/>
+        </w:rPr>
+        <w:t xml:space="preserve">Textbook Reference: </w:t>
+      </w:r>
+      <w:r>
+        <w:rPr>
+          <w:rFonts w:ascii="Times New Roman" w:hAnsi="Times New Roman" w:cs="Times New Roman"/>
+          <w:i/>
+          <w:iCs/>
+        </w:rPr>
+        <w:t xml:space="preserve">Chapter </w:t>
+      </w:r>
+      <w:r>
+        <w:rPr>
+          <w:rFonts w:ascii="Times New Roman" w:hAnsi="Times New Roman" w:cs="Times New Roman"/>
+          <w:i/>
+          <w:iCs/>
+        </w:rPr>
+        <w:t>17;</w:t>
+      </w:r>
+      <w:r>
+        <w:rPr>
+          <w:rFonts w:ascii="Times New Roman" w:hAnsi="Times New Roman" w:cs="Times New Roman"/>
+          <w:i/>
+          <w:iCs/>
+        </w:rPr>
+        <w:t xml:space="preserve"> Transaction Management </w:t>
+      </w:r>
+      <w:r>
+        <w:rPr>
+          <w:rFonts w:ascii="Times New Roman" w:hAnsi="Times New Roman" w:cs="Times New Roman"/>
+          <w:i/>
+          <w:iCs/>
+        </w:rPr>
+        <w:t xml:space="preserve"> </w:t>
       </w:r>
     </w:p>
     <w:p>
@@ -4345,6 +5001,73 @@
           <w:sz w:val="28"/>
           <w:szCs w:val="28"/>
         </w:rPr>
+        <w:t>Transactions</w:t>
+      </w:r>
+    </w:p>
+    <w:p>
+      <w:pPr>
+        <w:rPr>
+          <w:rFonts w:ascii="Times New Roman" w:hAnsi="Times New Roman" w:cs="Times New Roman"/>
+        </w:rPr>
+      </w:pPr>
+      <w:r>
+        <w:rPr>
+          <w:rFonts w:ascii="Times New Roman" w:hAnsi="Times New Roman" w:cs="Times New Roman"/>
+        </w:rPr>
+        <w:t xml:space="preserve">I mainly utilized transactional safety when working on running the INSERT queries from the data source tables into the final normalized </w:t>
+      </w:r>
+      <w:r>
+        <w:rPr>
+          <w:rFonts w:ascii="Times New Roman" w:hAnsi="Times New Roman" w:cs="Times New Roman"/>
+        </w:rPr>
+        <w:t>schema</w:t>
+      </w:r>
+      <w:r>
+        <w:rPr>
+          <w:rFonts w:ascii="Times New Roman" w:hAnsi="Times New Roman" w:cs="Times New Roman"/>
+        </w:rPr>
+        <w:t xml:space="preserve">. </w:t>
+      </w:r>
+      <w:r>
+        <w:rPr>
+          <w:rFonts w:ascii="Times New Roman" w:hAnsi="Times New Roman" w:cs="Times New Roman"/>
+        </w:rPr>
+        <w:t>W</w:t>
+      </w:r>
+      <w:r>
+        <w:rPr>
+          <w:rFonts w:ascii="Times New Roman" w:hAnsi="Times New Roman" w:cs="Times New Roman"/>
+        </w:rPr>
+        <w:t>hile doing this one thing that I wanted to keep track of and manage is only</w:t>
+      </w:r>
+      <w:r>
+        <w:rPr>
+          <w:rFonts w:ascii="Times New Roman" w:hAnsi="Times New Roman" w:cs="Times New Roman"/>
+        </w:rPr>
+        <w:t xml:space="preserve"> to update the normalized namespace tables if the entire migrations script succeeds. To achieve this, I created an individual SQL script file for each source and wrapped all the migration logic (aka the INSERT queries) in a single transaction using BEGIN TRANSACTION and COMMIT. This allows all INSERT statements to be executed within one transaction block, and if any step fails during execution, the transaction is not committed, the transaction is automatically rolled back and none of the data that was being transferred during the transaction makes it into any of the normalized namespace tables. This approach guarantees no partial data ever makes it into any of the tables and I don’t have worry about data duplication or remnant data existing from a previous data transformation/migration attempt.</w:t>
+      </w:r>
+    </w:p>
+    <w:p>
+      <w:pPr>
+        <w:pStyle w:val="Heading2"/>
+        <w:rPr>
+          <w:rFonts w:asciiTheme="minorHAnsi" w:eastAsia="Arial" w:hAnsiTheme="minorHAnsi" w:cs="Arial"/>
+          <w:b/>
+          <w:bCs/>
+          <w:color w:val="156082" w:themeColor="accent1"/>
+          <w:sz w:val="28"/>
+          <w:szCs w:val="28"/>
+        </w:rPr>
+      </w:pPr>
+      <w:r>
+        <w:rPr>
+          <w:rFonts w:asciiTheme="minorHAnsi" w:eastAsia="Arial" w:hAnsiTheme="minorHAnsi" w:cs="Arial"/>
+          <w:b/>
+          <w:bCs/>
+          <w:color w:val="156082" w:themeColor="accent1"/>
+          <w:sz w:val="28"/>
+          <w:szCs w:val="28"/>
+        </w:rPr>
         <w:t>ACID Compliance</w:t>
       </w:r>
     </w:p>
@@ -4438,8 +5161,14 @@
         <w:rPr>
           <w:rFonts w:ascii="Times New Roman" w:hAnsi="Times New Roman" w:cs="Times New Roman"/>
         </w:rPr>
+        <w:t xml:space="preserve">It is also worth noting that both DuckDB and PostgreSQL are ACID compliant databases, but they are optimized for different use cases. DuckDB on one hand is designed for OLAP (analytical) workloads, making it well suited for data transformation and processing tasks. </w:t>
+      </w:r>
+      <w:r>
+        <w:rPr>
+          <w:rFonts w:ascii="Times New Roman" w:hAnsi="Times New Roman" w:cs="Times New Roman"/>
+        </w:rPr>
         <w:lastRenderedPageBreak/>
-        <w:t xml:space="preserve">It is also worth noting that both DuckDB and PostgreSQL are ACID compliant databases, but they are optimized for different use cases. DuckDB on one hand is designed for OLAP (analytical) workloads, making it well suited for data transformation and processing tasks. PostgreSQL on the other hand is optimized for OLTP (transactional) workloads and supports high concurrency, making it </w:t>
+        <w:t xml:space="preserve">PostgreSQL on the other hand is optimized for OLTP (transactional) workloads and supports high concurrency, making it </w:t>
       </w:r>
       <w:r>
         <w:rPr>
@@ -4636,29 +5365,87 @@
     <w:p>
       <w:pPr>
         <w:rPr>
-          <w:rFonts w:ascii="Times New Roman" w:hAnsi="Times New Roman" w:cs="Times New Roman"/>
-        </w:rPr>
-      </w:pPr>
-      <w:r>
-        <w:rPr>
-          <w:rFonts w:ascii="Times New Roman" w:eastAsia="Arial" w:hAnsi="Times New Roman" w:cs="Times New Roman"/>
-          <w:color w:val="1A1A1A"/>
-        </w:rPr>
-        <w:t>Although I learned a lot, I also discovered limitations that, as of writing this, have not allowed me to complete the API and frontend layers of this project.</w:t>
-      </w:r>
-    </w:p>
-    <w:p>
-      <w:pPr>
-        <w:rPr>
-          <w:rFonts w:ascii="Times New Roman" w:hAnsi="Times New Roman" w:cs="Times New Roman"/>
-        </w:rPr>
-      </w:pPr>
-      <w:r>
-        <w:rPr>
-          <w:rFonts w:ascii="Times New Roman" w:eastAsia="Arial" w:hAnsi="Times New Roman" w:cs="Times New Roman"/>
-          <w:color w:val="1A1A1A"/>
-        </w:rPr>
-        <w:t xml:space="preserve">First, not all data sources are equally complete. The NPS data source is the most comprehensive. However, the MN DNR and MN GIS data sources are only partial, and there is meaningful overlap between them that ideally would be merged. The next step for this project after the semester would be to create a process that analyzes locations by their latitude and longitude </w:t>
+          <w:rFonts w:ascii="Times New Roman" w:eastAsia="Arial" w:hAnsi="Times New Roman" w:cs="Times New Roman"/>
+          <w:color w:val="1A1A1A"/>
+        </w:rPr>
+      </w:pPr>
+      <w:r>
+        <w:rPr>
+          <w:rFonts w:ascii="Times New Roman" w:eastAsia="Arial" w:hAnsi="Times New Roman" w:cs="Times New Roman"/>
+          <w:color w:val="1A1A1A"/>
+        </w:rPr>
+        <w:t xml:space="preserve">Although I learned a lot, I also </w:t>
+      </w:r>
+      <w:r>
+        <w:rPr>
+          <w:rFonts w:ascii="Times New Roman" w:eastAsia="Arial" w:hAnsi="Times New Roman" w:cs="Times New Roman"/>
+          <w:color w:val="1A1A1A"/>
+        </w:rPr>
+        <w:t xml:space="preserve">learned of some limitations that will need to be addressed as I continue with this project. </w:t>
+      </w:r>
+    </w:p>
+    <w:p>
+      <w:pPr>
+        <w:rPr>
+          <w:rFonts w:ascii="Times New Roman" w:eastAsia="Arial" w:hAnsi="Times New Roman" w:cs="Times New Roman"/>
+          <w:color w:val="1A1A1A"/>
+        </w:rPr>
+      </w:pPr>
+      <w:r>
+        <w:rPr>
+          <w:rFonts w:ascii="Times New Roman" w:eastAsia="Arial" w:hAnsi="Times New Roman" w:cs="Times New Roman"/>
+          <w:color w:val="1A1A1A"/>
+        </w:rPr>
+        <w:t>First, not all data sources are equally complete. The NPS</w:t>
+      </w:r>
+      <w:r>
+        <w:rPr>
+          <w:rFonts w:ascii="Times New Roman" w:eastAsia="Arial" w:hAnsi="Times New Roman" w:cs="Times New Roman"/>
+          <w:color w:val="1A1A1A"/>
+        </w:rPr>
+        <w:t xml:space="preserve"> and RIDB</w:t>
+      </w:r>
+      <w:r>
+        <w:rPr>
+          <w:rFonts w:ascii="Times New Roman" w:eastAsia="Arial" w:hAnsi="Times New Roman" w:cs="Times New Roman"/>
+          <w:color w:val="1A1A1A"/>
+        </w:rPr>
+        <w:t xml:space="preserve"> data source</w:t>
+      </w:r>
+      <w:r>
+        <w:rPr>
+          <w:rFonts w:ascii="Times New Roman" w:eastAsia="Arial" w:hAnsi="Times New Roman" w:cs="Times New Roman"/>
+          <w:color w:val="1A1A1A"/>
+        </w:rPr>
+        <w:t>s</w:t>
+      </w:r>
+      <w:r>
+        <w:rPr>
+          <w:rFonts w:ascii="Times New Roman" w:eastAsia="Arial" w:hAnsi="Times New Roman" w:cs="Times New Roman"/>
+          <w:color w:val="1A1A1A"/>
+        </w:rPr>
+        <w:t xml:space="preserve"> </w:t>
+      </w:r>
+      <w:r>
+        <w:rPr>
+          <w:rFonts w:ascii="Times New Roman" w:eastAsia="Arial" w:hAnsi="Times New Roman" w:cs="Times New Roman"/>
+          <w:color w:val="1A1A1A"/>
+        </w:rPr>
+        <w:t>are</w:t>
+      </w:r>
+      <w:r>
+        <w:rPr>
+          <w:rFonts w:ascii="Times New Roman" w:eastAsia="Arial" w:hAnsi="Times New Roman" w:cs="Times New Roman"/>
+          <w:color w:val="1A1A1A"/>
+        </w:rPr>
+        <w:t xml:space="preserve"> the most comprehensive. However, the MN DNR and MN GIS data sources are only partial, and there is meaningful overlap between them that ideally would be merged. </w:t>
+      </w:r>
+      <w:r>
+        <w:rPr>
+          <w:rFonts w:ascii="Times New Roman" w:eastAsia="Arial" w:hAnsi="Times New Roman" w:cs="Times New Roman"/>
+          <w:color w:val="1A1A1A"/>
+        </w:rPr>
+        <w:t xml:space="preserve">Although I did implement a simple merge for some of the MN DNR and MN GIS data, I’d need to build upon this to ensure data accuracy and consistency. One process that I plan to build to help mitigate this is a location deduplication workflow. It will analyze location records by their latitude and longitude proximity </w:t>
       </w:r>
       <w:r>
         <w:rPr>
@@ -4666,7 +5453,7 @@
           <w:color w:val="1A1A1A"/>
         </w:rPr>
         <w:lastRenderedPageBreak/>
-        <w:t>proximity and estimates which locations should be merged, made parent-child relationships, or treated as distinct entities.</w:t>
+        <w:t xml:space="preserve">and determine whether nearby records should be merged, reorganized into parent-child relationships, or treated as distinct entities. </w:t>
       </w:r>
     </w:p>
     <w:p>
@@ -4736,56 +5523,66 @@
           <w:rFonts w:ascii="Times New Roman" w:eastAsia="Arial" w:hAnsi="Times New Roman" w:cs="Times New Roman"/>
           <w:color w:val="1A1A1A"/>
         </w:rPr>
-        <w:t>. The same was not as straightforward with Google Places or MN GIS data.</w:t>
-      </w:r>
-    </w:p>
-    <w:p>
-      <w:pPr>
-        <w:rPr>
-          <w:rFonts w:ascii="Times New Roman" w:hAnsi="Times New Roman" w:cs="Times New Roman"/>
-        </w:rPr>
-      </w:pPr>
-      <w:r>
-        <w:rPr>
-          <w:rFonts w:ascii="Times New Roman" w:eastAsia="Arial" w:hAnsi="Times New Roman" w:cs="Times New Roman"/>
-          <w:color w:val="1A1A1A"/>
-        </w:rPr>
-        <w:t xml:space="preserve">Third, the non-completion of the optimistic goal — migrating data to PostgreSQL and building the API and frontend layers — was due to the minimum viable project turning out to be more involved than originally </w:t>
-      </w:r>
-      <w:r>
-        <w:rPr>
-          <w:rFonts w:ascii="Times New Roman" w:eastAsia="Arial" w:hAnsi="Times New Roman" w:cs="Times New Roman"/>
-          <w:color w:val="1A1A1A"/>
-        </w:rPr>
-        <w:t>thought</w:t>
-      </w:r>
-      <w:r>
-        <w:rPr>
-          <w:rFonts w:ascii="Times New Roman" w:eastAsia="Arial" w:hAnsi="Times New Roman" w:cs="Times New Roman"/>
-          <w:color w:val="1A1A1A"/>
-        </w:rPr>
-        <w:t xml:space="preserve">. Writing and validating the SQL transformation </w:t>
-      </w:r>
-      <w:r>
-        <w:rPr>
-          <w:rFonts w:ascii="Times New Roman" w:eastAsia="Arial" w:hAnsi="Times New Roman" w:cs="Times New Roman"/>
-          <w:color w:val="1A1A1A"/>
-        </w:rPr>
-        <w:t xml:space="preserve">scripts with views and </w:t>
-      </w:r>
-      <w:r>
-        <w:rPr>
-          <w:rFonts w:ascii="Times New Roman" w:eastAsia="Arial" w:hAnsi="Times New Roman" w:cs="Times New Roman"/>
-          <w:color w:val="1A1A1A"/>
-        </w:rPr>
-        <w:t>INSERT</w:t>
-      </w:r>
-      <w:r>
-        <w:rPr>
-          <w:rFonts w:ascii="Times New Roman" w:eastAsia="Arial" w:hAnsi="Times New Roman" w:cs="Times New Roman"/>
-          <w:color w:val="1A1A1A"/>
-        </w:rPr>
-        <w:t xml:space="preserve"> queries took additional time to complete. </w:t>
+        <w:t>. The same was not as straightforward with Google Places or MN GIS data</w:t>
+      </w:r>
+      <w:r>
+        <w:rPr>
+          <w:rFonts w:ascii="Times New Roman" w:eastAsia="Arial" w:hAnsi="Times New Roman" w:cs="Times New Roman"/>
+          <w:color w:val="1A1A1A"/>
+        </w:rPr>
+        <w:t xml:space="preserve"> entirely</w:t>
+      </w:r>
+      <w:r>
+        <w:rPr>
+          <w:rFonts w:ascii="Times New Roman" w:eastAsia="Arial" w:hAnsi="Times New Roman" w:cs="Times New Roman"/>
+          <w:color w:val="1A1A1A"/>
+        </w:rPr>
+        <w:t>.</w:t>
+      </w:r>
+    </w:p>
+    <w:p>
+      <w:pPr>
+        <w:rPr>
+          <w:rFonts w:ascii="Times New Roman" w:eastAsia="Arial" w:hAnsi="Times New Roman" w:cs="Times New Roman"/>
+          <w:color w:val="1A1A1A"/>
+        </w:rPr>
+      </w:pPr>
+      <w:r>
+        <w:rPr>
+          <w:rFonts w:ascii="Times New Roman" w:eastAsia="Arial" w:hAnsi="Times New Roman" w:cs="Times New Roman"/>
+          <w:color w:val="1A1A1A"/>
+        </w:rPr>
+        <w:t xml:space="preserve">Third, </w:t>
+      </w:r>
+      <w:r>
+        <w:rPr>
+          <w:rFonts w:ascii="Times New Roman" w:eastAsia="Arial" w:hAnsi="Times New Roman" w:cs="Times New Roman"/>
+          <w:color w:val="1A1A1A"/>
+        </w:rPr>
+        <w:t xml:space="preserve">as mentioned earlier in this document the geospatial queries that were attempted within DuckDB didn’t return the desired results based on the extension working entirely on planar calculations with no consideration for spherical calculations that </w:t>
+      </w:r>
+      <w:proofErr w:type="gramStart"/>
+      <w:r>
+        <w:rPr>
+          <w:rFonts w:ascii="Times New Roman" w:eastAsia="Arial" w:hAnsi="Times New Roman" w:cs="Times New Roman"/>
+          <w:color w:val="1A1A1A"/>
+        </w:rPr>
+        <w:t>take into account</w:t>
+      </w:r>
+      <w:proofErr w:type="gramEnd"/>
+      <w:r>
+        <w:rPr>
+          <w:rFonts w:ascii="Times New Roman" w:eastAsia="Arial" w:hAnsi="Times New Roman" w:cs="Times New Roman"/>
+          <w:color w:val="1A1A1A"/>
+        </w:rPr>
+        <w:t xml:space="preserve"> the Earth’s curvature. </w:t>
+      </w:r>
+      <w:r>
+        <w:rPr>
+          <w:rFonts w:ascii="Times New Roman" w:eastAsia="Arial" w:hAnsi="Times New Roman" w:cs="Times New Roman"/>
+          <w:color w:val="1A1A1A"/>
+        </w:rPr>
+        <w:t>To mitigate this, I migrated the data into a PostgreSQL database and utilized the POSTGIS extension to derive the results that I was seeking.</w:t>
       </w:r>
     </w:p>
     <w:p>
@@ -4944,21 +5741,33 @@
           <w:sz w:val="28"/>
           <w:szCs w:val="28"/>
         </w:rPr>
-        <w:t>Optimistic Goal Not Completed</w:t>
-      </w:r>
-    </w:p>
-    <w:p>
-      <w:pPr>
-        <w:rPr>
-          <w:rFonts w:ascii="Times New Roman" w:hAnsi="Times New Roman" w:cs="Times New Roman"/>
-        </w:rPr>
-      </w:pPr>
-      <w:r>
-        <w:rPr>
-          <w:rFonts w:ascii="Times New Roman" w:eastAsia="Arial" w:hAnsi="Times New Roman" w:cs="Times New Roman"/>
-          <w:color w:val="1A1A1A"/>
-        </w:rPr>
-        <w:t>The PostgreSQL migration, Django API, and React frontend were not completed within the scope of this semester. The minimum viable project took more time than originally estimated, leaving insufficient time for the full-stack layers. These remain planned next steps for the project beyond this class.</w:t>
+        <w:t>Flexible JSON structure of the Location Table’s attributes column</w:t>
+      </w:r>
+    </w:p>
+    <w:p>
+      <w:pPr>
+        <w:rPr>
+          <w:rFonts w:ascii="Times New Roman" w:hAnsi="Times New Roman" w:cs="Times New Roman"/>
+        </w:rPr>
+      </w:pPr>
+      <w:r>
+        <w:rPr>
+          <w:rFonts w:ascii="Times New Roman" w:hAnsi="Times New Roman" w:cs="Times New Roman"/>
+        </w:rPr>
+        <w:t xml:space="preserve">For the data transformation from each source to the normalized tables I needed a flexible column to catch any data that didn’t fit into specific table columns. This resulted in a flexible column where the JSON data represented many different properties that came from each source. This was fine until the data got to the frontend where I needed to add many different checks within the code and Typescript types to properly map out and display the flexible data. This added a lot of additional development time to the frontend and should be mitigated in the future but analyzing the flexible JSON data in all the locations </w:t>
+      </w:r>
+      <w:r>
+        <w:rPr>
+          <w:rFonts w:ascii="Times New Roman" w:hAnsi="Times New Roman" w:cs="Times New Roman"/>
+        </w:rPr>
+        <w:t xml:space="preserve">and restructuring the database so the attributes JSON </w:t>
+      </w:r>
+      <w:r>
+        <w:rPr>
+          <w:rFonts w:ascii="Times New Roman" w:hAnsi="Times New Roman" w:cs="Times New Roman"/>
+        </w:rPr>
+        <w:lastRenderedPageBreak/>
+        <w:t xml:space="preserve">column can be removed completely. This will main the database, and frontend easier to maintain and understand long term. </w:t>
       </w:r>
     </w:p>
     <w:p>
@@ -5017,7 +5826,6 @@
           <w:bCs/>
           <w:color w:val="1A1A1A"/>
         </w:rPr>
-        <w:lastRenderedPageBreak/>
         <w:t>Data Licensing and Public Availability</w:t>
       </w:r>
       <w:r>
@@ -5222,14 +6030,6 @@
     </w:p>
     <w:p>
       <w:pPr>
-        <w:spacing w:after="100" w:line="240" w:lineRule="auto"/>
-        <w:rPr>
-          <w:rFonts w:ascii="Times New Roman" w:hAnsi="Times New Roman" w:cs="Times New Roman"/>
-        </w:rPr>
-      </w:pPr>
-    </w:p>
-    <w:p>
-      <w:pPr>
         <w:rPr>
           <w:b/>
           <w:bCs/>
@@ -5259,13 +6059,13 @@
         <w:rPr>
           <w:rFonts w:ascii="Times New Roman" w:hAnsi="Times New Roman" w:cs="Times New Roman"/>
         </w:rPr>
-        <w:t>Although this project’s optimistic goals weren’t entirely complete as of writing this document,</w:t>
-      </w:r>
-      <w:r>
-        <w:rPr>
-          <w:rFonts w:ascii="Times New Roman" w:hAnsi="Times New Roman" w:cs="Times New Roman"/>
-        </w:rPr>
-        <w:t xml:space="preserve"> the foundation that has been built is one I’m proud of and plan to continue working on after the conclusion of this class. Working through this project has reinforced that building something meaningful with data requires more than just knowing the SQL or Python syntax. Rather it requires understanding the concepts well enough to make deliberate design decisions, like choosing how to model a self-referencing hierarchy, identification of different entities and the relationships between them, when to use a view versus a Python script or how to structure a transaction so that failures are recoverable. DuckDB proved to be an interesting and powerful tool for this kind of data management and transformation project, and this project gave me a real-world context to apply nearly everything covered in this course. Ultimately, what started as a side project I wanted to build for myself – a better way to access information about Minnesota’s parks, forests and campgrounds – has become something I now have a much stronger foundation to continue working on and eventually finish.</w:t>
+        <w:t xml:space="preserve">Although this project’s optimistic goals were completed, there is still much to do with this project that I plan to continue working on after the conclusion of this class. </w:t>
+      </w:r>
+      <w:r>
+        <w:rPr>
+          <w:rFonts w:ascii="Times New Roman" w:hAnsi="Times New Roman" w:cs="Times New Roman"/>
+        </w:rPr>
+        <w:t>Working through this project has reinforced that building something meaningful with data requires more than just knowing the SQL or Python syntax. Rather it requires understanding the concepts well enough to make deliberate design decisions, like choosing how to model a self-referencing hierarchy, identification of different entities and the relationships between them, when to use a view versus a Python script or how to structure a transaction so that failures are recoverable. DuckDB proved to be an interesting and powerful tool for this kind of data management and transformation project, and this project gave me a real-world context to apply nearly everything covered in this course. Ultimately, what started as a side project I wanted to build for myself – a better way to access information about Minnesota’s parks, forests and campgrounds – has become something I now have a much stronger foundation to continue working on and eventually finish.</w:t>
       </w:r>
       <w:r>
         <w:rPr>
@@ -5276,6 +6076,7 @@
     </w:p>
     <w:p>
       <w:pPr>
+        <w:jc w:val="center"/>
         <w:rPr>
           <w:b/>
           <w:bCs/>
@@ -5284,10 +6085,7 @@
           <w:szCs w:val="32"/>
         </w:rPr>
       </w:pPr>
-    </w:p>
-    <w:p>
-      <w:pPr>
-        <w:jc w:val="center"/>
+      <w:r>
         <w:rPr>
           <w:b/>
           <w:bCs/>
@@ -5295,27 +6093,6 @@
           <w:sz w:val="32"/>
           <w:szCs w:val="32"/>
         </w:rPr>
-      </w:pPr>
-    </w:p>
-    <w:p>
-      <w:pPr>
-        <w:jc w:val="center"/>
-        <w:rPr>
-          <w:b/>
-          <w:bCs/>
-          <w:color w:val="156082" w:themeColor="accent1"/>
-          <w:sz w:val="32"/>
-          <w:szCs w:val="32"/>
-        </w:rPr>
-      </w:pPr>
-      <w:r>
-        <w:rPr>
-          <w:b/>
-          <w:bCs/>
-          <w:color w:val="156082" w:themeColor="accent1"/>
-          <w:sz w:val="32"/>
-          <w:szCs w:val="32"/>
-        </w:rPr>
         <w:lastRenderedPageBreak/>
         <w:t>Works Cited</w:t>
       </w:r>
@@ -5372,7 +6149,7 @@
         </w:rPr>
         <w:t xml:space="preserve"> Map Library, </w:t>
       </w:r>
-      <w:hyperlink r:id="rId27" w:history="1">
+      <w:hyperlink r:id="rId32" w:history="1">
         <w:r>
           <w:rPr>
             <w:rStyle w:val="Hyperlink"/>
@@ -5488,7 +6265,7 @@
         </w:rPr>
         <w:t xml:space="preserve"> </w:t>
       </w:r>
-      <w:hyperlink r:id="rId28" w:history="1">
+      <w:hyperlink r:id="rId33" w:history="1">
         <w:r>
           <w:rPr>
             <w:rStyle w:val="Hyperlink"/>
@@ -5550,7 +6327,7 @@
         </w:rPr>
         <w:t xml:space="preserve">, Wikipedia, 3 Dec. 2024,  </w:t>
       </w:r>
-      <w:hyperlink r:id="rId29" w:history="1">
+      <w:hyperlink r:id="rId34" w:history="1">
         <w:r>
           <w:rPr>
             <w:rStyle w:val="Hyperlink"/>
@@ -5630,7 +6407,7 @@
         </w:rPr>
         <w:t xml:space="preserve">, </w:t>
       </w:r>
-      <w:hyperlink r:id="rId30" w:history="1">
+      <w:hyperlink r:id="rId35" w:history="1">
         <w:r>
           <w:rPr>
             <w:rStyle w:val="Hyperlink"/>
@@ -5742,7 +6519,7 @@
         </w:rPr>
         <w:t xml:space="preserve"> </w:t>
       </w:r>
-      <w:hyperlink r:id="rId31" w:history="1">
+      <w:hyperlink r:id="rId36" w:history="1">
         <w:r>
           <w:rPr>
             <w:rStyle w:val="Hyperlink"/>
@@ -5889,7 +6666,7 @@
         </w:rPr>
         <w:t xml:space="preserve"> </w:t>
       </w:r>
-      <w:hyperlink r:id="rId32" w:history="1">
+      <w:hyperlink r:id="rId37" w:history="1">
         <w:r>
           <w:rPr>
             <w:rStyle w:val="Hyperlink"/>
@@ -5921,13 +6698,7 @@
         <w:rPr>
           <w:rFonts w:ascii="Times New Roman" w:hAnsi="Times New Roman" w:cs="Times New Roman"/>
         </w:rPr>
-        <w:t>“Schema.”</w:t>
-      </w:r>
-      <w:r>
-        <w:rPr>
-          <w:rFonts w:ascii="Times New Roman" w:hAnsi="Times New Roman" w:cs="Times New Roman"/>
-        </w:rPr>
-        <w:t xml:space="preserve"> </w:t>
+        <w:t xml:space="preserve">“PostgreSQL Extension” </w:t>
       </w:r>
       <w:r>
         <w:rPr>
@@ -5935,7 +6706,47 @@
           <w:i/>
           <w:iCs/>
         </w:rPr>
-        <w:t>m</w:t>
+        <w:t>duckdb.org</w:t>
+      </w:r>
+      <w:r>
+        <w:rPr>
+          <w:rFonts w:ascii="Times New Roman" w:hAnsi="Times New Roman" w:cs="Times New Roman"/>
+        </w:rPr>
+        <w:t xml:space="preserve">, DuckDB Docs, </w:t>
+      </w:r>
+      <w:hyperlink r:id="rId38" w:history="1">
+        <w:r>
+          <w:rPr>
+            <w:rStyle w:val="Hyperlink"/>
+            <w:rFonts w:ascii="Times New Roman" w:hAnsi="Times New Roman" w:cs="Times New Roman"/>
+          </w:rPr>
+          <w:t>https://duckdb.org/docs/current/core_extensions/postgres</w:t>
+        </w:r>
+      </w:hyperlink>
+      <w:r>
+        <w:rPr>
+          <w:rFonts w:ascii="Times New Roman" w:hAnsi="Times New Roman" w:cs="Times New Roman"/>
+        </w:rPr>
+        <w:t xml:space="preserve">. Accessed 5 May 2026. </w:t>
+      </w:r>
+    </w:p>
+    <w:p>
+      <w:pPr>
+        <w:rPr>
+          <w:rFonts w:ascii="Times New Roman" w:hAnsi="Times New Roman" w:cs="Times New Roman"/>
+        </w:rPr>
+      </w:pPr>
+      <w:r>
+        <w:rPr>
+          <w:rFonts w:ascii="Times New Roman" w:hAnsi="Times New Roman" w:cs="Times New Roman"/>
+        </w:rPr>
+        <w:t>“Schema.”</w:t>
+      </w:r>
+      <w:r>
+        <w:rPr>
+          <w:rFonts w:ascii="Times New Roman" w:hAnsi="Times New Roman" w:cs="Times New Roman"/>
+        </w:rPr>
+        <w:t xml:space="preserve"> </w:t>
       </w:r>
       <w:r>
         <w:rPr>
@@ -5943,6 +6754,14 @@
           <w:i/>
           <w:iCs/>
         </w:rPr>
+        <w:t>m</w:t>
+      </w:r>
+      <w:r>
+        <w:rPr>
+          <w:rFonts w:ascii="Times New Roman" w:hAnsi="Times New Roman" w:cs="Times New Roman"/>
+          <w:i/>
+          <w:iCs/>
+        </w:rPr>
         <w:t>otherduck.com</w:t>
       </w:r>
       <w:r>
@@ -5971,7 +6790,7 @@
         </w:rPr>
         <w:t xml:space="preserve"> Glossary, </w:t>
       </w:r>
-      <w:hyperlink r:id="rId33" w:history="1">
+      <w:hyperlink r:id="rId39" w:history="1">
         <w:r>
           <w:rPr>
             <w:rStyle w:val="Hyperlink"/>
@@ -6043,7 +6862,7 @@
         </w:rPr>
         <w:t xml:space="preserve">, </w:t>
       </w:r>
-      <w:hyperlink r:id="rId34" w:history="1">
+      <w:hyperlink r:id="rId40" w:history="1">
         <w:r>
           <w:rPr>
             <w:rStyle w:val="Hyperlink"/>
@@ -6081,9 +6900,85 @@
         <w:rPr>
           <w:rFonts w:ascii="Times New Roman" w:hAnsi="Times New Roman" w:cs="Times New Roman"/>
         </w:rPr>
+        <w:t>“</w:t>
+      </w:r>
+      <w:proofErr w:type="spellStart"/>
+      <w:r>
+        <w:rPr>
+          <w:rFonts w:ascii="Times New Roman" w:hAnsi="Times New Roman" w:cs="Times New Roman"/>
+        </w:rPr>
+        <w:t>ST_Distance</w:t>
+      </w:r>
+      <w:proofErr w:type="spellEnd"/>
+      <w:r>
+        <w:rPr>
+          <w:rFonts w:ascii="Times New Roman" w:hAnsi="Times New Roman" w:cs="Times New Roman"/>
+        </w:rPr>
+        <w:t xml:space="preserve">.” </w:t>
+      </w:r>
+      <w:r>
+        <w:rPr>
+          <w:rFonts w:ascii="Times New Roman" w:hAnsi="Times New Roman" w:cs="Times New Roman"/>
+          <w:i/>
+          <w:iCs/>
+        </w:rPr>
+        <w:t>postgis.net</w:t>
+      </w:r>
+      <w:r>
+        <w:rPr>
+          <w:rFonts w:ascii="Times New Roman" w:hAnsi="Times New Roman" w:cs="Times New Roman"/>
+        </w:rPr>
+        <w:t xml:space="preserve">, </w:t>
+      </w:r>
+      <w:proofErr w:type="spellStart"/>
+      <w:r>
+        <w:rPr>
+          <w:rFonts w:ascii="Times New Roman" w:hAnsi="Times New Roman" w:cs="Times New Roman"/>
+        </w:rPr>
+        <w:t>Postgis</w:t>
+      </w:r>
+      <w:proofErr w:type="spellEnd"/>
+      <w:r>
+        <w:rPr>
+          <w:rFonts w:ascii="Times New Roman" w:hAnsi="Times New Roman" w:cs="Times New Roman"/>
+        </w:rPr>
+        <w:t xml:space="preserve">, </w:t>
+      </w:r>
+      <w:hyperlink r:id="rId41" w:history="1">
+        <w:r>
+          <w:rPr>
+            <w:rStyle w:val="Hyperlink"/>
+            <w:rFonts w:ascii="Times New Roman" w:hAnsi="Times New Roman" w:cs="Times New Roman"/>
+          </w:rPr>
+          <w:t>https://postgis.net/docs/ST_Distance.html</w:t>
+        </w:r>
+      </w:hyperlink>
+      <w:r>
+        <w:rPr>
+          <w:rFonts w:ascii="Times New Roman" w:hAnsi="Times New Roman" w:cs="Times New Roman"/>
+        </w:rPr>
+        <w:t xml:space="preserve">. </w:t>
+      </w:r>
+      <w:r>
+        <w:rPr>
+          <w:rFonts w:ascii="Times New Roman" w:hAnsi="Times New Roman" w:cs="Times New Roman"/>
+        </w:rPr>
+        <w:t>Accessed 5 May 2026.</w:t>
+      </w:r>
+    </w:p>
+    <w:p>
+      <w:pPr>
+        <w:rPr>
+          <w:rFonts w:ascii="Times New Roman" w:hAnsi="Times New Roman" w:cs="Times New Roman"/>
+        </w:rPr>
+      </w:pPr>
+      <w:r>
+        <w:rPr>
+          <w:rFonts w:ascii="Times New Roman" w:hAnsi="Times New Roman" w:cs="Times New Roman"/>
+        </w:rPr>
         <w:t xml:space="preserve">“Top 5 Spatial Databases for GIS Professionals in 2025.” Geodata Insights, </w:t>
       </w:r>
-      <w:hyperlink r:id="rId35" w:history="1">
+      <w:hyperlink r:id="rId42" w:history="1">
         <w:r>
           <w:rPr>
             <w:rStyle w:val="Hyperlink"/>
@@ -6121,6 +7016,7 @@
         <w:rPr>
           <w:rFonts w:ascii="Times New Roman" w:hAnsi="Times New Roman" w:cs="Times New Roman"/>
         </w:rPr>
+        <w:lastRenderedPageBreak/>
         <w:t xml:space="preserve">Veeraraghavan, Anantharaman. </w:t>
       </w:r>
       <w:r>
@@ -6167,7 +7063,7 @@
         </w:rPr>
         <w:t xml:space="preserve"> Minuscule Technologies, </w:t>
       </w:r>
-      <w:hyperlink r:id="rId36" w:history="1">
+      <w:hyperlink r:id="rId43" w:history="1">
         <w:r>
           <w:rPr>
             <w:rStyle w:val="Hyperlink"/>
@@ -6206,7 +7102,10 @@
           <w:szCs w:val="32"/>
         </w:rPr>
       </w:pPr>
-      <w:r>
+    </w:p>
+    <w:p>
+      <w:pPr>
+        <w:jc w:val="center"/>
         <w:rPr>
           <w:b/>
           <w:bCs/>
@@ -6214,6 +7113,208 @@
           <w:sz w:val="32"/>
           <w:szCs w:val="32"/>
         </w:rPr>
+      </w:pPr>
+    </w:p>
+    <w:p>
+      <w:pPr>
+        <w:jc w:val="center"/>
+        <w:rPr>
+          <w:b/>
+          <w:bCs/>
+          <w:color w:val="156082" w:themeColor="accent1"/>
+          <w:sz w:val="32"/>
+          <w:szCs w:val="32"/>
+        </w:rPr>
+      </w:pPr>
+    </w:p>
+    <w:p>
+      <w:pPr>
+        <w:jc w:val="center"/>
+        <w:rPr>
+          <w:b/>
+          <w:bCs/>
+          <w:color w:val="156082" w:themeColor="accent1"/>
+          <w:sz w:val="32"/>
+          <w:szCs w:val="32"/>
+        </w:rPr>
+      </w:pPr>
+    </w:p>
+    <w:p>
+      <w:pPr>
+        <w:jc w:val="center"/>
+        <w:rPr>
+          <w:b/>
+          <w:bCs/>
+          <w:color w:val="156082" w:themeColor="accent1"/>
+          <w:sz w:val="32"/>
+          <w:szCs w:val="32"/>
+        </w:rPr>
+      </w:pPr>
+    </w:p>
+    <w:p>
+      <w:pPr>
+        <w:jc w:val="center"/>
+        <w:rPr>
+          <w:b/>
+          <w:bCs/>
+          <w:color w:val="156082" w:themeColor="accent1"/>
+          <w:sz w:val="32"/>
+          <w:szCs w:val="32"/>
+        </w:rPr>
+      </w:pPr>
+    </w:p>
+    <w:p>
+      <w:pPr>
+        <w:jc w:val="center"/>
+        <w:rPr>
+          <w:b/>
+          <w:bCs/>
+          <w:color w:val="156082" w:themeColor="accent1"/>
+          <w:sz w:val="32"/>
+          <w:szCs w:val="32"/>
+        </w:rPr>
+      </w:pPr>
+    </w:p>
+    <w:p>
+      <w:pPr>
+        <w:jc w:val="center"/>
+        <w:rPr>
+          <w:b/>
+          <w:bCs/>
+          <w:color w:val="156082" w:themeColor="accent1"/>
+          <w:sz w:val="32"/>
+          <w:szCs w:val="32"/>
+        </w:rPr>
+      </w:pPr>
+    </w:p>
+    <w:p>
+      <w:pPr>
+        <w:jc w:val="center"/>
+        <w:rPr>
+          <w:b/>
+          <w:bCs/>
+          <w:color w:val="156082" w:themeColor="accent1"/>
+          <w:sz w:val="32"/>
+          <w:szCs w:val="32"/>
+        </w:rPr>
+      </w:pPr>
+    </w:p>
+    <w:p>
+      <w:pPr>
+        <w:jc w:val="center"/>
+        <w:rPr>
+          <w:b/>
+          <w:bCs/>
+          <w:color w:val="156082" w:themeColor="accent1"/>
+          <w:sz w:val="32"/>
+          <w:szCs w:val="32"/>
+        </w:rPr>
+      </w:pPr>
+    </w:p>
+    <w:p>
+      <w:pPr>
+        <w:jc w:val="center"/>
+        <w:rPr>
+          <w:b/>
+          <w:bCs/>
+          <w:color w:val="156082" w:themeColor="accent1"/>
+          <w:sz w:val="32"/>
+          <w:szCs w:val="32"/>
+        </w:rPr>
+      </w:pPr>
+    </w:p>
+    <w:p>
+      <w:pPr>
+        <w:jc w:val="center"/>
+        <w:rPr>
+          <w:b/>
+          <w:bCs/>
+          <w:color w:val="156082" w:themeColor="accent1"/>
+          <w:sz w:val="32"/>
+          <w:szCs w:val="32"/>
+        </w:rPr>
+      </w:pPr>
+    </w:p>
+    <w:p>
+      <w:pPr>
+        <w:jc w:val="center"/>
+        <w:rPr>
+          <w:b/>
+          <w:bCs/>
+          <w:color w:val="156082" w:themeColor="accent1"/>
+          <w:sz w:val="32"/>
+          <w:szCs w:val="32"/>
+        </w:rPr>
+      </w:pPr>
+    </w:p>
+    <w:p>
+      <w:pPr>
+        <w:jc w:val="center"/>
+        <w:rPr>
+          <w:b/>
+          <w:bCs/>
+          <w:color w:val="156082" w:themeColor="accent1"/>
+          <w:sz w:val="32"/>
+          <w:szCs w:val="32"/>
+        </w:rPr>
+      </w:pPr>
+    </w:p>
+    <w:p>
+      <w:pPr>
+        <w:jc w:val="center"/>
+        <w:rPr>
+          <w:b/>
+          <w:bCs/>
+          <w:color w:val="156082" w:themeColor="accent1"/>
+          <w:sz w:val="32"/>
+          <w:szCs w:val="32"/>
+        </w:rPr>
+      </w:pPr>
+    </w:p>
+    <w:p>
+      <w:pPr>
+        <w:jc w:val="center"/>
+        <w:rPr>
+          <w:b/>
+          <w:bCs/>
+          <w:color w:val="156082" w:themeColor="accent1"/>
+          <w:sz w:val="32"/>
+          <w:szCs w:val="32"/>
+        </w:rPr>
+      </w:pPr>
+    </w:p>
+    <w:p>
+      <w:pPr>
+        <w:jc w:val="center"/>
+        <w:rPr>
+          <w:b/>
+          <w:bCs/>
+          <w:color w:val="156082" w:themeColor="accent1"/>
+          <w:sz w:val="32"/>
+          <w:szCs w:val="32"/>
+        </w:rPr>
+      </w:pPr>
+    </w:p>
+    <w:p>
+      <w:pPr>
+        <w:jc w:val="center"/>
+        <w:rPr>
+          <w:b/>
+          <w:bCs/>
+          <w:color w:val="156082" w:themeColor="accent1"/>
+          <w:sz w:val="32"/>
+          <w:szCs w:val="32"/>
+        </w:rPr>
+      </w:pPr>
+      <w:r>
+        <w:rPr>
+          <w:b/>
+          <w:bCs/>
+          <w:color w:val="156082" w:themeColor="accent1"/>
+          <w:sz w:val="32"/>
+          <w:szCs w:val="32"/>
+        </w:rPr>
+        <w:lastRenderedPageBreak/>
         <w:t>Resources</w:t>
       </w:r>
     </w:p>
@@ -6227,10 +7328,9 @@
         <w:rPr>
           <w:rFonts w:ascii="Times New Roman" w:hAnsi="Times New Roman" w:cs="Times New Roman"/>
         </w:rPr>
-        <w:lastRenderedPageBreak/>
         <w:t xml:space="preserve">ChatGPT Discussion: </w:t>
       </w:r>
-      <w:hyperlink r:id="rId37" w:history="1">
+      <w:hyperlink r:id="rId44" w:history="1">
         <w:r>
           <w:rPr>
             <w:rStyle w:val="Hyperlink"/>
@@ -6252,7 +7352,7 @@
         </w:rPr>
         <w:t xml:space="preserve">DuckDB Repository: </w:t>
       </w:r>
-      <w:hyperlink r:id="rId38" w:history="1">
+      <w:hyperlink r:id="rId45" w:history="1">
         <w:r>
           <w:rPr>
             <w:rStyle w:val="Hyperlink"/>
@@ -6274,7 +7374,7 @@
         </w:rPr>
         <w:t xml:space="preserve">DuckDB Documentation: </w:t>
       </w:r>
-      <w:hyperlink r:id="rId39" w:history="1">
+      <w:hyperlink r:id="rId46" w:history="1">
         <w:r>
           <w:rPr>
             <w:rStyle w:val="Hyperlink"/>
@@ -6302,7 +7402,7 @@
         </w:rPr>
         <w:t xml:space="preserve">GitHub Repository where project is managed: </w:t>
       </w:r>
-      <w:hyperlink r:id="rId40" w:history="1">
+      <w:hyperlink r:id="rId47" w:history="1">
         <w:r>
           <w:rPr>
             <w:rStyle w:val="Hyperlink"/>
@@ -6330,7 +7430,7 @@
         </w:rPr>
         <w:t xml:space="preserve">PostgreSQL Documentation: </w:t>
       </w:r>
-      <w:hyperlink r:id="rId41" w:history="1">
+      <w:hyperlink r:id="rId48" w:history="1">
         <w:r>
           <w:rPr>
             <w:rStyle w:val="Hyperlink"/>
@@ -6346,13 +7446,43 @@
         <w:t xml:space="preserve"> </w:t>
       </w:r>
     </w:p>
+    <w:p>
+      <w:pPr>
+        <w:rPr>
+          <w:rFonts w:ascii="Times New Roman" w:hAnsi="Times New Roman" w:cs="Times New Roman"/>
+        </w:rPr>
+      </w:pPr>
+      <w:r>
+        <w:rPr>
+          <w:rFonts w:ascii="Times New Roman" w:hAnsi="Times New Roman" w:cs="Times New Roman"/>
+        </w:rPr>
+        <w:t>PostgreSQL Database Download Link</w:t>
+      </w:r>
+      <w:r>
+        <w:rPr>
+          <w:rFonts w:ascii="Times New Roman" w:hAnsi="Times New Roman" w:cs="Times New Roman"/>
+          <w:b/>
+          <w:bCs/>
+        </w:rPr>
+        <w:t xml:space="preserve">: </w:t>
+      </w:r>
+      <w:hyperlink r:id="rId49" w:history="1">
+        <w:r>
+          <w:rPr>
+            <w:rStyle w:val="Hyperlink"/>
+            <w:rFonts w:ascii="Times New Roman" w:hAnsi="Times New Roman" w:cs="Times New Roman"/>
+          </w:rPr>
+          <w:t>https://www.postgresql.org/download/</w:t>
+        </w:r>
+      </w:hyperlink>
+    </w:p>
     <w:sectPr>
-      <w:headerReference w:type="even" r:id="rId42"/>
-      <w:headerReference w:type="default" r:id="rId43"/>
-      <w:footerReference w:type="even" r:id="rId44"/>
-      <w:footerReference w:type="default" r:id="rId45"/>
-      <w:headerReference w:type="first" r:id="rId46"/>
-      <w:footerReference w:type="first" r:id="rId47"/>
+      <w:headerReference w:type="even" r:id="rId50"/>
+      <w:headerReference w:type="default" r:id="rId51"/>
+      <w:footerReference w:type="even" r:id="rId52"/>
+      <w:footerReference w:type="default" r:id="rId53"/>
+      <w:headerReference w:type="first" r:id="rId54"/>
+      <w:footerReference w:type="first" r:id="rId55"/>
       <w:pgSz w:w="12240" w:h="15840"/>
       <w:pgMar w:top="1440" w:right="1440" w:bottom="1440" w:left="1440" w:header="720" w:footer="720" w:gutter="0"/>
       <w:cols w:space="720"/>
@@ -8576,7 +9706,7 @@
   <w:style w:type="paragraph" w:default="1" w:styleId="Normal">
     <w:name w:val="Normal"/>
     <w:qFormat/>
-    <w:rsid w:val="00377872"/>
+    <w:rsid w:val="008164D4"/>
   </w:style>
   <w:style w:type="paragraph" w:styleId="Heading1">
     <w:name w:val="heading 1"/>
@@ -8779,7 +9909,6 @@
   <w:style w:type="character" w:default="1" w:styleId="DefaultParagraphFont">
     <w:name w:val="Default Paragraph Font"/>
     <w:uiPriority w:val="1"/>
-    <w:semiHidden/>
     <w:unhideWhenUsed/>
   </w:style>
   <w:style w:type="table" w:default="1" w:styleId="TableNormal">

</xml_diff>